<commit_message>
Keep on working on my report.
</commit_message>
<xml_diff>
--- a/src/Report.docx
+++ b/src/Report.docx
@@ -87,6 +87,11 @@
       </w:r>
     </w:p>
     <w:p>
+      <w:pPr>
+        <w:rPr>
+          <w:lang w:val="en-US"/>
+        </w:rPr>
+      </w:pPr>
       <w:r>
         <w:rPr>
           <w:lang w:val="en-US"/>
@@ -98,6 +103,2983 @@
           <w:lang w:val="en-US"/>
         </w:rPr>
         <w:t xml:space="preserve"> – Send in the Rogues</w:t>
+      </w:r>
+    </w:p>
+    <w:p>
+      <w:pPr>
+        <w:rPr>
+          <w:lang w:val="en-US"/>
+        </w:rPr>
+      </w:pPr>
+    </w:p>
+    <w:p>
+      <w:pPr>
+        <w:pStyle w:val="ListParagraph"/>
+        <w:numPr>
+          <w:ilvl w:val="0"/>
+          <w:numId w:val="2"/>
+        </w:numPr>
+      </w:pPr>
+      <w:r>
+        <w:rPr>
+          <w:lang w:val="en-US"/>
+        </w:rPr>
+        <w:t>Project Overview</w:t>
+      </w:r>
+    </w:p>
+    <w:p>
+      <w:pPr>
+        <w:rPr>
+          <w:lang w:val="en-US"/>
+        </w:rPr>
+      </w:pPr>
+    </w:p>
+    <w:p>
+      <w:pPr>
+        <w:rPr>
+          <w:lang w:val="en-US"/>
+        </w:rPr>
+      </w:pPr>
+      <w:r>
+        <w:rPr>
+          <w:lang w:val="en-US"/>
+        </w:rPr>
+        <w:t>The goal of this project was to</w:t>
+      </w:r>
+      <w:r>
+        <w:rPr>
+          <w:lang w:val="en-US"/>
+        </w:rPr>
+        <w:t xml:space="preserve"> create an AI for </w:t>
+      </w:r>
+      <w:r>
+        <w:rPr>
+          <w:lang w:val="en-US"/>
+        </w:rPr>
+        <w:t>one or more rogues</w:t>
+      </w:r>
+      <w:r>
+        <w:rPr>
+          <w:lang w:val="en-US"/>
+        </w:rPr>
+        <w:t xml:space="preserve"> exploring a dungeon.</w:t>
+      </w:r>
+      <w:r>
+        <w:rPr>
+          <w:lang w:val="en-US"/>
+        </w:rPr>
+        <w:t xml:space="preserve"> The rogues need to collect</w:t>
+      </w:r>
+      <w:r>
+        <w:rPr>
+          <w:lang w:val="en-US"/>
+        </w:rPr>
+        <w:t xml:space="preserve"> treasures while avoiding</w:t>
+      </w:r>
+      <w:r>
+        <w:rPr>
+          <w:lang w:val="en-US"/>
+        </w:rPr>
+        <w:t xml:space="preserve"> or disarming hidden traps</w:t>
+      </w:r>
+      <w:r>
+        <w:rPr>
+          <w:lang w:val="en-US"/>
+        </w:rPr>
+        <w:t>. The dungeon is a grid-based</w:t>
+      </w:r>
+      <w:r>
+        <w:rPr>
+          <w:lang w:val="en-US"/>
+        </w:rPr>
+        <w:t xml:space="preserve"> environment with walls</w:t>
+      </w:r>
+      <w:r>
+        <w:rPr>
+          <w:lang w:val="en-US"/>
+        </w:rPr>
+        <w:t>, open spaces</w:t>
+      </w:r>
+      <w:r>
+        <w:rPr>
+          <w:lang w:val="en-US"/>
+        </w:rPr>
+        <w:t>, treasures, traps</w:t>
+      </w:r>
+      <w:r>
+        <w:rPr>
+          <w:lang w:val="en-US"/>
+        </w:rPr>
+        <w:t>, and teleporters.</w:t>
+      </w:r>
+    </w:p>
+    <w:p>
+      <w:pPr>
+        <w:rPr>
+          <w:lang w:val="en-US"/>
+        </w:rPr>
+      </w:pPr>
+    </w:p>
+    <w:p>
+      <w:pPr>
+        <w:rPr>
+          <w:lang w:val="en-US"/>
+        </w:rPr>
+      </w:pPr>
+      <w:r>
+        <w:rPr>
+          <w:lang w:val="en-US"/>
+        </w:rPr>
+        <w:t>The challenge is that the rogue</w:t>
+      </w:r>
+      <w:r>
+        <w:rPr>
+          <w:lang w:val="en-US"/>
+        </w:rPr>
+        <w:t xml:space="preserve"> does not know the whole map</w:t>
+      </w:r>
+      <w:r>
+        <w:rPr>
+          <w:lang w:val="en-US"/>
+        </w:rPr>
+        <w:t>. It only receives</w:t>
+      </w:r>
+      <w:r>
+        <w:rPr>
+          <w:lang w:val="en-US"/>
+        </w:rPr>
+        <w:t xml:space="preserve"> information through</w:t>
+      </w:r>
+      <w:r>
+        <w:rPr>
+          <w:lang w:val="en-US"/>
+        </w:rPr>
+        <w:t xml:space="preserve"> percepts</w:t>
+      </w:r>
+      <w:r>
+        <w:rPr>
+          <w:lang w:val="en-US"/>
+        </w:rPr>
+        <w:t>.</w:t>
+      </w:r>
+      <w:r>
+        <w:rPr>
+          <w:lang w:val="en-US"/>
+        </w:rPr>
+        <w:t xml:space="preserve"> It can see in four directions</w:t>
+      </w:r>
+      <w:r>
+        <w:rPr>
+          <w:lang w:val="en-US"/>
+        </w:rPr>
+        <w:t>, it knows what cell</w:t>
+      </w:r>
+      <w:r>
+        <w:rPr>
+          <w:lang w:val="en-US"/>
+        </w:rPr>
+        <w:t xml:space="preserve"> it is standing on</w:t>
+      </w:r>
+      <w:r>
+        <w:rPr>
+          <w:lang w:val="en-US"/>
+        </w:rPr>
+        <w:t>, it receives the Manhattan</w:t>
+      </w:r>
+      <w:r>
+        <w:rPr>
+          <w:lang w:val="en-US"/>
+        </w:rPr>
+        <w:t xml:space="preserve"> distance to the nearest trap</w:t>
+      </w:r>
+      <w:r>
+        <w:rPr>
+          <w:lang w:val="en-US"/>
+        </w:rPr>
+        <w:t>, and it receives relative</w:t>
+      </w:r>
+      <w:r>
+        <w:rPr>
+          <w:lang w:val="en-US"/>
+        </w:rPr>
+        <w:t xml:space="preserve"> positions of other rogues</w:t>
+      </w:r>
+      <w:r>
+        <w:rPr>
+          <w:lang w:val="en-US"/>
+        </w:rPr>
+        <w:t>.</w:t>
+      </w:r>
+      <w:r>
+        <w:rPr>
+          <w:lang w:val="en-US"/>
+        </w:rPr>
+        <w:t xml:space="preserve"> Hidden traps are especially difficult</w:t>
+      </w:r>
+      <w:r>
+        <w:rPr>
+          <w:lang w:val="en-US"/>
+        </w:rPr>
+        <w:t xml:space="preserve"> because they look like normal</w:t>
+      </w:r>
+      <w:r>
+        <w:rPr>
+          <w:lang w:val="en-US"/>
+        </w:rPr>
+        <w:t xml:space="preserve"> open cells to the rogue</w:t>
+      </w:r>
+      <w:r>
+        <w:rPr>
+          <w:lang w:val="en-US"/>
+        </w:rPr>
+        <w:t>.</w:t>
+      </w:r>
+    </w:p>
+    <w:p>
+      <w:pPr>
+        <w:rPr>
+          <w:lang w:val="en-US"/>
+        </w:rPr>
+      </w:pPr>
+    </w:p>
+    <w:p>
+      <w:pPr>
+        <w:rPr>
+          <w:lang w:val="en-US"/>
+        </w:rPr>
+      </w:pPr>
+      <w:r>
+        <w:rPr>
+          <w:lang w:val="en-US"/>
+        </w:rPr>
+        <w:t>My solution is a stateful AI</w:t>
+      </w:r>
+      <w:r>
+        <w:rPr>
+          <w:lang w:val="en-US"/>
+        </w:rPr>
+        <w:t>.</w:t>
+      </w:r>
+      <w:r>
+        <w:rPr>
+          <w:lang w:val="en-US"/>
+        </w:rPr>
+        <w:t xml:space="preserve"> Instead of making decisions randomly</w:t>
+      </w:r>
+      <w:r>
+        <w:rPr>
+          <w:lang w:val="en-US"/>
+        </w:rPr>
+        <w:t>, the rogue keeps</w:t>
+      </w:r>
+      <w:r>
+        <w:rPr>
+          <w:lang w:val="en-US"/>
+        </w:rPr>
+        <w:t xml:space="preserve"> memory about what it has seen</w:t>
+      </w:r>
+      <w:r>
+        <w:rPr>
+          <w:lang w:val="en-US"/>
+        </w:rPr>
+        <w:t>.</w:t>
+      </w:r>
+      <w:r>
+        <w:rPr>
+          <w:lang w:val="en-US"/>
+        </w:rPr>
+        <w:t xml:space="preserve"> It builds an internal map</w:t>
+      </w:r>
+      <w:r>
+        <w:rPr>
+          <w:lang w:val="en-US"/>
+        </w:rPr>
+        <w:t>, tracks its own</w:t>
+      </w:r>
+      <w:r>
+        <w:rPr>
+          <w:lang w:val="en-US"/>
+        </w:rPr>
+        <w:t xml:space="preserve"> relative position</w:t>
+      </w:r>
+      <w:r>
+        <w:rPr>
+          <w:lang w:val="en-US"/>
+        </w:rPr>
+        <w:t xml:space="preserve"> and direction</w:t>
+      </w:r>
+      <w:r>
+        <w:rPr>
+          <w:lang w:val="en-US"/>
+        </w:rPr>
+        <w:t>, uses BFS</w:t>
+      </w:r>
+      <w:r>
+        <w:rPr>
+          <w:lang w:val="en-US"/>
+        </w:rPr>
+        <w:t xml:space="preserve"> pathfinding to</w:t>
+      </w:r>
+      <w:r>
+        <w:rPr>
+          <w:lang w:val="en-US"/>
+        </w:rPr>
+        <w:t xml:space="preserve"> move toward</w:t>
+      </w:r>
+      <w:r>
+        <w:rPr>
+          <w:lang w:val="en-US"/>
+        </w:rPr>
+        <w:t xml:space="preserve"> known treasures</w:t>
+      </w:r>
+      <w:r>
+        <w:rPr>
+          <w:lang w:val="en-US"/>
+        </w:rPr>
+        <w:t>, reasons about possible</w:t>
+      </w:r>
+      <w:r>
+        <w:rPr>
+          <w:lang w:val="en-US"/>
+        </w:rPr>
+        <w:t xml:space="preserve"> trap locations</w:t>
+      </w:r>
+      <w:r>
+        <w:rPr>
+          <w:lang w:val="en-US"/>
+        </w:rPr>
+        <w:t>, and uses simple</w:t>
+      </w:r>
+      <w:r>
+        <w:rPr>
+          <w:lang w:val="en-US"/>
+        </w:rPr>
+        <w:t xml:space="preserve"> communication in</w:t>
+      </w:r>
+      <w:r>
+        <w:rPr>
+          <w:lang w:val="en-US"/>
+        </w:rPr>
+        <w:t xml:space="preserve"> multi-agent situations.</w:t>
+      </w:r>
+    </w:p>
+    <w:p>
+      <w:pPr>
+        <w:rPr>
+          <w:lang w:val="en-US"/>
+        </w:rPr>
+      </w:pPr>
+    </w:p>
+    <w:p>
+      <w:pPr>
+        <w:rPr>
+          <w:lang w:val="en-US"/>
+        </w:rPr>
+      </w:pPr>
+      <w:r>
+        <w:rPr>
+          <w:lang w:val="en-US"/>
+        </w:rPr>
+        <w:t>The solution is not perfect</w:t>
+      </w:r>
+      <w:r>
+        <w:rPr>
+          <w:lang w:val="en-US"/>
+        </w:rPr>
+        <w:t>, but it attempts to</w:t>
+      </w:r>
+      <w:r>
+        <w:rPr>
+          <w:lang w:val="en-US"/>
+        </w:rPr>
+        <w:t xml:space="preserve"> solve the main AI</w:t>
+      </w:r>
+      <w:r>
+        <w:rPr>
+          <w:lang w:val="en-US"/>
+        </w:rPr>
+        <w:t xml:space="preserve"> problems of</w:t>
+      </w:r>
+      <w:r>
+        <w:rPr>
+          <w:lang w:val="en-US"/>
+        </w:rPr>
+        <w:t xml:space="preserve"> the assignment:</w:t>
+      </w:r>
+      <w:r>
+        <w:rPr>
+          <w:lang w:val="en-US"/>
+        </w:rPr>
+        <w:t xml:space="preserve"> exploration,</w:t>
+      </w:r>
+      <w:r>
+        <w:rPr>
+          <w:lang w:val="en-US"/>
+        </w:rPr>
+        <w:t xml:space="preserve"> memory, pathfinding</w:t>
+      </w:r>
+      <w:r>
+        <w:rPr>
+          <w:lang w:val="en-US"/>
+        </w:rPr>
+        <w:t>, uncertainty</w:t>
+      </w:r>
+      <w:r>
+        <w:rPr>
+          <w:lang w:val="en-US"/>
+        </w:rPr>
+        <w:t>, trap detection</w:t>
+      </w:r>
+      <w:r>
+        <w:rPr>
+          <w:lang w:val="en-US"/>
+        </w:rPr>
+        <w:t>, and basic cooperation</w:t>
+      </w:r>
+      <w:r>
+        <w:rPr>
+          <w:lang w:val="en-US"/>
+        </w:rPr>
+        <w:t xml:space="preserve"> between agents.</w:t>
+      </w:r>
+    </w:p>
+    <w:p>
+      <w:pPr>
+        <w:rPr>
+          <w:lang w:val="en-US"/>
+        </w:rPr>
+      </w:pPr>
+    </w:p>
+    <w:p>
+      <w:pPr>
+        <w:pStyle w:val="ListParagraph"/>
+        <w:numPr>
+          <w:ilvl w:val="0"/>
+          <w:numId w:val="2"/>
+        </w:numPr>
+        <w:rPr>
+          <w:lang w:val="en-US"/>
+        </w:rPr>
+      </w:pPr>
+      <w:r>
+        <w:rPr>
+          <w:lang w:val="en-US"/>
+        </w:rPr>
+        <w:t>A</w:t>
+      </w:r>
+      <w:r>
+        <w:rPr>
+          <w:lang w:val="en-US"/>
+        </w:rPr>
+        <w:t>I</w:t>
+      </w:r>
+      <w:r>
+        <w:rPr>
+          <w:lang w:val="en-US"/>
+        </w:rPr>
+        <w:t xml:space="preserve"> Design</w:t>
+      </w:r>
+    </w:p>
+    <w:p>
+      <w:pPr>
+        <w:rPr>
+          <w:lang w:val="en-US"/>
+        </w:rPr>
+      </w:pPr>
+    </w:p>
+    <w:p>
+      <w:pPr>
+        <w:rPr>
+          <w:lang w:val="en-US"/>
+        </w:rPr>
+      </w:pPr>
+      <w:r>
+        <w:rPr>
+          <w:lang w:val="en-US"/>
+        </w:rPr>
+        <w:t>The AI uses</w:t>
+      </w:r>
+      <w:r>
+        <w:rPr>
+          <w:lang w:val="en-US"/>
+        </w:rPr>
+        <w:t xml:space="preserve"> an internal coordinate system.</w:t>
+      </w:r>
+      <w:r>
+        <w:rPr>
+          <w:lang w:val="en-US"/>
+        </w:rPr>
+        <w:t xml:space="preserve"> At the beginning, the rogue</w:t>
+      </w:r>
+      <w:r>
+        <w:rPr>
+          <w:lang w:val="en-US"/>
+        </w:rPr>
+        <w:t xml:space="preserve"> assumes that</w:t>
+      </w:r>
+      <w:r>
+        <w:rPr>
+          <w:lang w:val="en-US"/>
+        </w:rPr>
+        <w:t xml:space="preserve"> its starting</w:t>
+      </w:r>
+      <w:r>
+        <w:rPr>
+          <w:lang w:val="en-US"/>
+        </w:rPr>
+        <w:t xml:space="preserve"> position is </w:t>
+      </w:r>
+      <w:r>
+        <w:rPr>
+          <w:lang w:val="en-US"/>
+        </w:rPr>
+        <w:t>(0, 0).</w:t>
+      </w:r>
+      <w:r>
+        <w:rPr>
+          <w:lang w:val="en-US"/>
+        </w:rPr>
+        <w:t xml:space="preserve"> It also tracks its current direction.</w:t>
+      </w:r>
+      <w:r>
+        <w:rPr>
+          <w:lang w:val="en-US"/>
+        </w:rPr>
+        <w:t xml:space="preserve"> This direction does not have</w:t>
+      </w:r>
+      <w:r>
+        <w:rPr>
+          <w:lang w:val="en-US"/>
+        </w:rPr>
+        <w:t xml:space="preserve"> to match the real</w:t>
+      </w:r>
+      <w:r>
+        <w:rPr>
+          <w:lang w:val="en-US"/>
+        </w:rPr>
+        <w:t xml:space="preserve"> north or south </w:t>
+      </w:r>
+      <w:r>
+        <w:rPr>
+          <w:lang w:val="en-US"/>
+        </w:rPr>
+        <w:t>of the world</w:t>
+      </w:r>
+      <w:r>
+        <w:rPr>
+          <w:lang w:val="en-US"/>
+        </w:rPr>
+        <w:t>; it only needs to</w:t>
+      </w:r>
+      <w:r>
+        <w:rPr>
+          <w:lang w:val="en-US"/>
+        </w:rPr>
+        <w:t xml:space="preserve"> be consistent </w:t>
+      </w:r>
+      <w:r>
+        <w:rPr>
+          <w:lang w:val="en-US"/>
+        </w:rPr>
+        <w:t>for</w:t>
+      </w:r>
+      <w:r>
+        <w:rPr>
+          <w:lang w:val="en-US"/>
+        </w:rPr>
+        <w:t xml:space="preserve"> the rogue’s own</w:t>
+      </w:r>
+      <w:r>
+        <w:rPr>
+          <w:lang w:val="en-US"/>
+        </w:rPr>
+        <w:t xml:space="preserve"> internal map.</w:t>
+      </w:r>
+    </w:p>
+    <w:p>
+      <w:pPr>
+        <w:rPr>
+          <w:lang w:val="en-US"/>
+        </w:rPr>
+      </w:pPr>
+    </w:p>
+    <w:p>
+      <w:pPr>
+        <w:rPr>
+          <w:lang w:val="en-US"/>
+        </w:rPr>
+      </w:pPr>
+      <w:r>
+        <w:rPr>
+          <w:lang w:val="en-US"/>
+        </w:rPr>
+        <w:lastRenderedPageBreak/>
+        <w:t>Each turn,</w:t>
+      </w:r>
+      <w:r>
+        <w:rPr>
+          <w:lang w:val="en-US"/>
+        </w:rPr>
+        <w:t xml:space="preserve"> the AI updates</w:t>
+      </w:r>
+      <w:r>
+        <w:rPr>
+          <w:lang w:val="en-US"/>
+        </w:rPr>
+        <w:t xml:space="preserve"> its internal state</w:t>
+      </w:r>
+      <w:r>
+        <w:rPr>
+          <w:lang w:val="en-US"/>
+        </w:rPr>
+        <w:t xml:space="preserve"> using the last</w:t>
+      </w:r>
+      <w:r>
+        <w:rPr>
+          <w:lang w:val="en-US"/>
+        </w:rPr>
+        <w:t xml:space="preserve"> command it issued</w:t>
+      </w:r>
+      <w:r>
+        <w:rPr>
+          <w:lang w:val="en-US"/>
+        </w:rPr>
+        <w:t>.</w:t>
+      </w:r>
+      <w:r>
+        <w:rPr>
+          <w:lang w:val="en-US"/>
+        </w:rPr>
+        <w:t xml:space="preserve"> For example, if the</w:t>
+      </w:r>
+      <w:r>
+        <w:rPr>
+          <w:lang w:val="en-US"/>
+        </w:rPr>
+        <w:t xml:space="preserve"> previous command was</w:t>
+      </w:r>
+      <w:r>
+        <w:rPr>
+          <w:lang w:val="en-US"/>
+        </w:rPr>
+        <w:t xml:space="preserve"> moving forward</w:t>
+      </w:r>
+      <w:r>
+        <w:rPr>
+          <w:lang w:val="en-US"/>
+        </w:rPr>
+        <w:t>, the internal position</w:t>
+      </w:r>
+      <w:r>
+        <w:rPr>
+          <w:lang w:val="en-US"/>
+        </w:rPr>
+        <w:t xml:space="preserve"> is updated</w:t>
+      </w:r>
+      <w:r>
+        <w:rPr>
+          <w:lang w:val="en-US"/>
+        </w:rPr>
+        <w:t xml:space="preserve"> in the current facing</w:t>
+      </w:r>
+      <w:r>
+        <w:rPr>
+          <w:lang w:val="en-US"/>
+        </w:rPr>
+        <w:t xml:space="preserve"> direction.</w:t>
+      </w:r>
+      <w:r>
+        <w:rPr>
+          <w:lang w:val="en-US"/>
+        </w:rPr>
+        <w:t xml:space="preserve"> </w:t>
+      </w:r>
+      <w:r>
+        <w:rPr>
+          <w:lang w:val="en-US"/>
+        </w:rPr>
+        <w:t>If the previous command was</w:t>
+      </w:r>
+      <w:r>
+        <w:rPr>
+          <w:lang w:val="en-US"/>
+        </w:rPr>
+        <w:t xml:space="preserve"> turning left or right</w:t>
+      </w:r>
+      <w:r>
+        <w:rPr>
+          <w:lang w:val="en-US"/>
+        </w:rPr>
+        <w:t>, the internal direction is updated</w:t>
+      </w:r>
+      <w:r>
+        <w:rPr>
+          <w:lang w:val="en-US"/>
+        </w:rPr>
+        <w:t>.</w:t>
+      </w:r>
+    </w:p>
+    <w:p>
+      <w:pPr>
+        <w:rPr>
+          <w:lang w:val="en-US"/>
+        </w:rPr>
+      </w:pPr>
+    </w:p>
+    <w:p>
+      <w:pPr>
+        <w:rPr>
+          <w:lang w:val="en-US"/>
+        </w:rPr>
+      </w:pPr>
+      <w:r>
+        <w:rPr>
+          <w:lang w:val="en-US"/>
+        </w:rPr>
+        <w:t>After that, the rogue</w:t>
+      </w:r>
+      <w:r>
+        <w:rPr>
+          <w:lang w:val="en-US"/>
+        </w:rPr>
+        <w:t xml:space="preserve"> integrates its new</w:t>
+      </w:r>
+      <w:r>
+        <w:rPr>
+          <w:lang w:val="en-US"/>
+        </w:rPr>
+        <w:t xml:space="preserve"> percepts</w:t>
+      </w:r>
+      <w:r>
+        <w:rPr>
+          <w:lang w:val="en-US"/>
+        </w:rPr>
+        <w:t xml:space="preserve"> into its internal map</w:t>
+      </w:r>
+      <w:r>
+        <w:rPr>
+          <w:lang w:val="en-US"/>
+        </w:rPr>
+        <w:t>.</w:t>
+      </w:r>
+      <w:r>
+        <w:rPr>
+          <w:lang w:val="en-US"/>
+        </w:rPr>
+        <w:t xml:space="preserve"> The cells seen in front</w:t>
+      </w:r>
+      <w:r>
+        <w:rPr>
+          <w:lang w:val="en-US"/>
+        </w:rPr>
+        <w:t>, behind,</w:t>
+      </w:r>
+      <w:r>
+        <w:rPr>
+          <w:lang w:val="en-US"/>
+        </w:rPr>
+        <w:t xml:space="preserve"> left, and right</w:t>
+      </w:r>
+      <w:r>
+        <w:rPr>
+          <w:lang w:val="en-US"/>
+        </w:rPr>
+        <w:t xml:space="preserve"> are converted into</w:t>
+      </w:r>
+      <w:r>
+        <w:rPr>
+          <w:lang w:val="en-US"/>
+        </w:rPr>
+        <w:t xml:space="preserve"> internal coordinates</w:t>
+      </w:r>
+      <w:r>
+        <w:rPr>
+          <w:lang w:val="en-US"/>
+        </w:rPr>
+        <w:t xml:space="preserve"> and stored.</w:t>
+      </w:r>
+      <w:r>
+        <w:rPr>
+          <w:lang w:val="en-US"/>
+        </w:rPr>
+        <w:t xml:space="preserve"> This allows the rogue</w:t>
+      </w:r>
+      <w:r>
+        <w:rPr>
+          <w:lang w:val="en-US"/>
+        </w:rPr>
+        <w:t xml:space="preserve"> to remember</w:t>
+      </w:r>
+      <w:r>
+        <w:rPr>
+          <w:lang w:val="en-US"/>
+        </w:rPr>
+        <w:t xml:space="preserve"> walls, open spaces</w:t>
+      </w:r>
+      <w:r>
+        <w:rPr>
+          <w:lang w:val="en-US"/>
+        </w:rPr>
+        <w:t>, treasures</w:t>
+      </w:r>
+      <w:r>
+        <w:rPr>
+          <w:lang w:val="en-US"/>
+        </w:rPr>
+        <w:t>, and</w:t>
+      </w:r>
+      <w:r>
+        <w:rPr>
+          <w:lang w:val="en-US"/>
+        </w:rPr>
+        <w:t xml:space="preserve"> known</w:t>
+      </w:r>
+      <w:r>
+        <w:rPr>
+          <w:lang w:val="en-US"/>
+        </w:rPr>
+        <w:t xml:space="preserve"> safe cells</w:t>
+      </w:r>
+      <w:r>
+        <w:rPr>
+          <w:lang w:val="en-US"/>
+        </w:rPr>
+        <w:t xml:space="preserve"> even after they</w:t>
+      </w:r>
+      <w:r>
+        <w:rPr>
+          <w:lang w:val="en-US"/>
+        </w:rPr>
+        <w:t xml:space="preserve"> are no longer visible</w:t>
+      </w:r>
+      <w:r>
+        <w:rPr>
+          <w:lang w:val="en-US"/>
+        </w:rPr>
+        <w:t>.</w:t>
+      </w:r>
+    </w:p>
+    <w:p>
+      <w:pPr>
+        <w:rPr>
+          <w:lang w:val="en-US"/>
+        </w:rPr>
+      </w:pPr>
+    </w:p>
+    <w:p>
+      <w:pPr>
+        <w:rPr>
+          <w:lang w:val="en-US"/>
+        </w:rPr>
+      </w:pPr>
+      <w:r>
+        <w:rPr>
+          <w:lang w:val="en-US"/>
+        </w:rPr>
+        <w:t>The main decision order is</w:t>
+      </w:r>
+      <w:r>
+        <w:rPr>
+          <w:lang w:val="en-US"/>
+        </w:rPr>
+        <w:t>:</w:t>
+      </w:r>
+    </w:p>
+    <w:p>
+      <w:pPr>
+        <w:rPr>
+          <w:lang w:val="en-US"/>
+        </w:rPr>
+      </w:pPr>
+    </w:p>
+    <w:p>
+      <w:pPr>
+        <w:pStyle w:val="ListParagraph"/>
+        <w:numPr>
+          <w:ilvl w:val="0"/>
+          <w:numId w:val="3"/>
+        </w:numPr>
+        <w:rPr>
+          <w:lang w:val="en-US"/>
+        </w:rPr>
+      </w:pPr>
+      <w:r>
+        <w:rPr>
+          <w:lang w:val="en-US"/>
+        </w:rPr>
+        <w:t>Update position and direction</w:t>
+      </w:r>
+      <w:r>
+        <w:rPr>
+          <w:lang w:val="en-US"/>
+        </w:rPr>
+        <w:t xml:space="preserve"> from the previous command</w:t>
+      </w:r>
+      <w:r>
+        <w:rPr>
+          <w:lang w:val="en-US"/>
+        </w:rPr>
+        <w:t>.</w:t>
+      </w:r>
+    </w:p>
+    <w:p>
+      <w:pPr>
+        <w:pStyle w:val="ListParagraph"/>
+        <w:numPr>
+          <w:ilvl w:val="0"/>
+          <w:numId w:val="3"/>
+        </w:numPr>
+        <w:rPr>
+          <w:lang w:val="en-US"/>
+        </w:rPr>
+      </w:pPr>
+      <w:r>
+        <w:rPr>
+          <w:lang w:val="en-US"/>
+        </w:rPr>
+        <w:t>Add the current percepts</w:t>
+      </w:r>
+      <w:r>
+        <w:rPr>
+          <w:lang w:val="en-US"/>
+        </w:rPr>
+        <w:t xml:space="preserve"> to the internal map.</w:t>
+      </w:r>
+    </w:p>
+    <w:p>
+      <w:pPr>
+        <w:pStyle w:val="ListParagraph"/>
+        <w:numPr>
+          <w:ilvl w:val="0"/>
+          <w:numId w:val="3"/>
+        </w:numPr>
+        <w:rPr>
+          <w:lang w:val="en-US"/>
+        </w:rPr>
+      </w:pPr>
+      <w:r>
+        <w:rPr>
+          <w:lang w:val="en-US"/>
+        </w:rPr>
+        <w:t>If standing on treasure, take it.</w:t>
+      </w:r>
+    </w:p>
+    <w:p>
+      <w:pPr>
+        <w:pStyle w:val="ListParagraph"/>
+        <w:numPr>
+          <w:ilvl w:val="0"/>
+          <w:numId w:val="3"/>
+        </w:numPr>
+        <w:rPr>
+          <w:lang w:val="en-US"/>
+        </w:rPr>
+      </w:pPr>
+      <w:r>
+        <w:rPr>
+          <w:lang w:val="en-US"/>
+        </w:rPr>
+        <w:t>Use the trap detector to</w:t>
+      </w:r>
+      <w:r>
+        <w:rPr>
+          <w:lang w:val="en-US"/>
+        </w:rPr>
+        <w:t xml:space="preserve"> update safe an</w:t>
+      </w:r>
+      <w:r>
+        <w:rPr>
+          <w:lang w:val="en-US"/>
+        </w:rPr>
+        <w:t>d</w:t>
+      </w:r>
+      <w:r>
+        <w:rPr>
+          <w:lang w:val="en-US"/>
+        </w:rPr>
+        <w:t xml:space="preserve"> suspicious cells</w:t>
+      </w:r>
+      <w:r>
+        <w:rPr>
+          <w:lang w:val="en-US"/>
+        </w:rPr>
+        <w:t>.</w:t>
+      </w:r>
+    </w:p>
+    <w:p>
+      <w:pPr>
+        <w:pStyle w:val="ListParagraph"/>
+        <w:numPr>
+          <w:ilvl w:val="0"/>
+          <w:numId w:val="3"/>
+        </w:numPr>
+        <w:rPr>
+          <w:lang w:val="en-US"/>
+        </w:rPr>
+      </w:pPr>
+      <w:r>
+        <w:rPr>
+          <w:lang w:val="en-US"/>
+        </w:rPr>
+        <w:t>If a nearby trap is likely, try to disarm it.</w:t>
+      </w:r>
+    </w:p>
+    <w:p>
+      <w:pPr>
+        <w:pStyle w:val="ListParagraph"/>
+        <w:numPr>
+          <w:ilvl w:val="0"/>
+          <w:numId w:val="3"/>
+        </w:numPr>
+        <w:rPr>
+          <w:lang w:val="en-US"/>
+        </w:rPr>
+      </w:pPr>
+      <w:r>
+        <w:rPr>
+          <w:lang w:val="en-US"/>
+        </w:rPr>
+        <w:t>If a known treasure exists,</w:t>
+      </w:r>
+      <w:r>
+        <w:rPr>
+          <w:lang w:val="en-US"/>
+        </w:rPr>
+        <w:t xml:space="preserve"> use BFS to move toward it</w:t>
+      </w:r>
+      <w:r>
+        <w:rPr>
+          <w:lang w:val="en-US"/>
+        </w:rPr>
+        <w:t>.</w:t>
+      </w:r>
+    </w:p>
+    <w:p>
+      <w:pPr>
+        <w:pStyle w:val="ListParagraph"/>
+        <w:numPr>
+          <w:ilvl w:val="0"/>
+          <w:numId w:val="3"/>
+        </w:numPr>
+        <w:rPr>
+          <w:lang w:val="en-US"/>
+        </w:rPr>
+      </w:pPr>
+      <w:r>
+        <w:rPr>
+          <w:lang w:val="en-US"/>
+        </w:rPr>
+        <w:t>If there is no known treasure, explore safely.</w:t>
+      </w:r>
+    </w:p>
+    <w:p>
+      <w:pPr>
+        <w:pStyle w:val="ListParagraph"/>
+        <w:numPr>
+          <w:ilvl w:val="0"/>
+          <w:numId w:val="3"/>
+        </w:numPr>
+        <w:rPr>
+          <w:lang w:val="en-US"/>
+        </w:rPr>
+      </w:pPr>
+      <w:r>
+        <w:rPr>
+          <w:lang w:val="en-US"/>
+        </w:rPr>
+        <w:t>Avoid walls</w:t>
+      </w:r>
+      <w:r>
+        <w:rPr>
+          <w:lang w:val="en-US"/>
+        </w:rPr>
+        <w:t>, suspected traps</w:t>
+      </w:r>
+      <w:r>
+        <w:rPr>
+          <w:lang w:val="en-US"/>
+        </w:rPr>
+        <w:t>, and cells occupied</w:t>
+      </w:r>
+      <w:r>
+        <w:rPr>
+          <w:lang w:val="en-US"/>
+        </w:rPr>
+        <w:t xml:space="preserve"> by other rogues</w:t>
+      </w:r>
+      <w:r>
+        <w:rPr>
+          <w:lang w:val="en-US"/>
+        </w:rPr>
+        <w:t xml:space="preserve"> when possible.</w:t>
+      </w:r>
+    </w:p>
+    <w:p>
+      <w:pPr>
+        <w:rPr>
+          <w:lang w:val="en-US"/>
+        </w:rPr>
+      </w:pPr>
+    </w:p>
+    <w:p>
+      <w:pPr>
+        <w:rPr>
+          <w:lang w:val="en-US"/>
+        </w:rPr>
+      </w:pPr>
+      <w:r>
+        <w:rPr>
+          <w:lang w:val="en-US"/>
+        </w:rPr>
+        <w:t>For pathfinding</w:t>
+      </w:r>
+      <w:r>
+        <w:rPr>
+          <w:lang w:val="en-US"/>
+        </w:rPr>
+        <w:t>, I used BFS</w:t>
+      </w:r>
+      <w:r>
+        <w:rPr>
+          <w:lang w:val="en-US"/>
+        </w:rPr>
+        <w:t>, or Breadth-First Search</w:t>
+      </w:r>
+      <w:r>
+        <w:rPr>
+          <w:lang w:val="en-US"/>
+        </w:rPr>
+        <w:t>. BFS</w:t>
+      </w:r>
+      <w:r>
+        <w:rPr>
+          <w:lang w:val="en-US"/>
+        </w:rPr>
+        <w:t xml:space="preserve"> is appropriate because</w:t>
+      </w:r>
+      <w:r>
+        <w:rPr>
+          <w:lang w:val="en-US"/>
+        </w:rPr>
+        <w:t xml:space="preserve"> the environment is a</w:t>
+      </w:r>
+      <w:r>
+        <w:rPr>
+          <w:lang w:val="en-US"/>
+        </w:rPr>
+        <w:t xml:space="preserve"> grid and movement</w:t>
+      </w:r>
+      <w:r>
+        <w:rPr>
+          <w:lang w:val="en-US"/>
+        </w:rPr>
+        <w:t xml:space="preserve"> between adjacent cells</w:t>
+      </w:r>
+      <w:r>
+        <w:rPr>
+          <w:lang w:val="en-US"/>
+        </w:rPr>
+        <w:t xml:space="preserve"> has equal cost.</w:t>
+      </w:r>
+      <w:r>
+        <w:rPr>
+          <w:lang w:val="en-US"/>
+        </w:rPr>
+        <w:t xml:space="preserve"> The AI searches</w:t>
+      </w:r>
+      <w:r>
+        <w:rPr>
+          <w:lang w:val="en-US"/>
+        </w:rPr>
+        <w:t xml:space="preserve"> through known passable</w:t>
+      </w:r>
+      <w:r>
+        <w:rPr>
+          <w:lang w:val="en-US"/>
+        </w:rPr>
+        <w:t xml:space="preserve"> cells and finds</w:t>
+      </w:r>
+      <w:r>
+        <w:rPr>
+          <w:lang w:val="en-US"/>
+        </w:rPr>
+        <w:t xml:space="preserve"> the shortest known</w:t>
+      </w:r>
+      <w:r>
+        <w:rPr>
+          <w:lang w:val="en-US"/>
+        </w:rPr>
+        <w:t xml:space="preserve"> path to a treasure.</w:t>
+      </w:r>
+      <w:r>
+        <w:rPr>
+          <w:lang w:val="en-US"/>
+        </w:rPr>
+        <w:t xml:space="preserve"> Once a path is found</w:t>
+      </w:r>
+      <w:r>
+        <w:rPr>
+          <w:lang w:val="en-US"/>
+        </w:rPr>
+        <w:t>, the rogue only follows the</w:t>
+      </w:r>
+      <w:r>
+        <w:rPr>
+          <w:lang w:val="en-US"/>
+        </w:rPr>
+        <w:t xml:space="preserve"> first step of the path</w:t>
+      </w:r>
+      <w:r>
+        <w:rPr>
+          <w:lang w:val="en-US"/>
+        </w:rPr>
+        <w:t>.</w:t>
+      </w:r>
+      <w:r>
+        <w:rPr>
+          <w:lang w:val="en-US"/>
+        </w:rPr>
+        <w:t xml:space="preserve"> That step is converted</w:t>
+      </w:r>
+      <w:r>
+        <w:rPr>
+          <w:lang w:val="en-US"/>
+        </w:rPr>
+        <w:t xml:space="preserve"> into a command</w:t>
+      </w:r>
+      <w:r>
+        <w:rPr>
+          <w:lang w:val="en-US"/>
+        </w:rPr>
+        <w:t xml:space="preserve"> such as moving forward</w:t>
+      </w:r>
+      <w:r>
+        <w:rPr>
+          <w:lang w:val="en-US"/>
+        </w:rPr>
+        <w:t>, turning left</w:t>
+      </w:r>
+      <w:r>
+        <w:rPr>
+          <w:lang w:val="en-US"/>
+        </w:rPr>
+        <w:t>, turning right</w:t>
+      </w:r>
+      <w:r>
+        <w:rPr>
+          <w:lang w:val="en-US"/>
+        </w:rPr>
+        <w:t>, or moving backward.</w:t>
+      </w:r>
+    </w:p>
+    <w:p>
+      <w:pPr>
+        <w:rPr>
+          <w:lang w:val="en-US"/>
+        </w:rPr>
+      </w:pPr>
+    </w:p>
+    <w:p>
+      <w:pPr>
+        <w:rPr>
+          <w:lang w:val="en-US"/>
+        </w:rPr>
+      </w:pPr>
+      <w:r>
+        <w:rPr>
+          <w:lang w:val="en-US"/>
+        </w:rPr>
+        <w:t>Trap reasoning is based on uncertainty.</w:t>
+      </w:r>
+      <w:r>
+        <w:rPr>
+          <w:lang w:val="en-US"/>
+        </w:rPr>
+        <w:t xml:space="preserve"> The rogue cannot directly</w:t>
+      </w:r>
+      <w:r>
+        <w:rPr>
+          <w:lang w:val="en-US"/>
+        </w:rPr>
+        <w:t xml:space="preserve"> see hidden traps</w:t>
+      </w:r>
+      <w:r>
+        <w:rPr>
+          <w:lang w:val="en-US"/>
+        </w:rPr>
+        <w:t>, but it receives the</w:t>
+      </w:r>
+      <w:r>
+        <w:rPr>
+          <w:lang w:val="en-US"/>
+        </w:rPr>
+        <w:t xml:space="preserve"> distance to the nearest trap</w:t>
+      </w:r>
+      <w:r>
+        <w:rPr>
+          <w:lang w:val="en-US"/>
+        </w:rPr>
+        <w:t>. If the</w:t>
+      </w:r>
+      <w:r>
+        <w:rPr>
+          <w:lang w:val="en-US"/>
+        </w:rPr>
+        <w:t xml:space="preserve"> detector value is d</w:t>
+      </w:r>
+      <w:r>
+        <w:rPr>
+          <w:lang w:val="en-US"/>
+        </w:rPr>
+        <w:t>, then known cells</w:t>
+      </w:r>
+      <w:r>
+        <w:rPr>
+          <w:lang w:val="en-US"/>
+        </w:rPr>
+        <w:t xml:space="preserve"> closer than d</w:t>
+      </w:r>
+      <w:r>
+        <w:rPr>
+          <w:lang w:val="en-US"/>
+        </w:rPr>
+        <w:t xml:space="preserve"> cannot be the nearest trap</w:t>
+      </w:r>
+      <w:r>
+        <w:rPr>
+          <w:lang w:val="en-US"/>
+        </w:rPr>
+        <w:t>, so they are treated as safe.</w:t>
+      </w:r>
+      <w:r>
+        <w:rPr>
+          <w:lang w:val="en-US"/>
+        </w:rPr>
+        <w:t xml:space="preserve"> Cells at distance d</w:t>
+      </w:r>
+      <w:r>
+        <w:rPr>
+          <w:lang w:val="en-US"/>
+        </w:rPr>
+        <w:t xml:space="preserve"> are treated as</w:t>
+      </w:r>
+      <w:r>
+        <w:rPr>
+          <w:lang w:val="en-US"/>
+        </w:rPr>
+        <w:t xml:space="preserve"> possible trap candidates</w:t>
+      </w:r>
+      <w:r>
+        <w:rPr>
+          <w:lang w:val="en-US"/>
+        </w:rPr>
+        <w:t>.</w:t>
+      </w:r>
+      <w:r>
+        <w:rPr>
+          <w:lang w:val="en-US"/>
+        </w:rPr>
+        <w:t xml:space="preserve"> If the detector value is 1,</w:t>
+      </w:r>
+      <w:r>
+        <w:rPr>
+          <w:lang w:val="en-US"/>
+        </w:rPr>
+        <w:t xml:space="preserve"> then a trap must be</w:t>
+      </w:r>
+      <w:r>
+        <w:rPr>
+          <w:lang w:val="en-US"/>
+        </w:rPr>
+        <w:t xml:space="preserve"> adjacent</w:t>
+      </w:r>
+      <w:r>
+        <w:rPr>
+          <w:lang w:val="en-US"/>
+        </w:rPr>
+        <w:t>, so the AI tries</w:t>
+      </w:r>
+      <w:r>
+        <w:rPr>
+          <w:lang w:val="en-US"/>
+        </w:rPr>
+        <w:t xml:space="preserve"> to face</w:t>
+      </w:r>
+      <w:r>
+        <w:rPr>
+          <w:lang w:val="en-US"/>
+        </w:rPr>
+        <w:t xml:space="preserve"> and disarm the most</w:t>
+      </w:r>
+      <w:r>
+        <w:rPr>
+          <w:lang w:val="en-US"/>
+        </w:rPr>
+        <w:t xml:space="preserve"> suspicious neighboring cell</w:t>
+      </w:r>
+      <w:r>
+        <w:rPr>
+          <w:lang w:val="en-US"/>
+        </w:rPr>
+        <w:t>.</w:t>
+      </w:r>
+    </w:p>
+    <w:p>
+      <w:pPr>
+        <w:rPr>
+          <w:lang w:val="en-US"/>
+        </w:rPr>
+      </w:pPr>
+    </w:p>
+    <w:p>
+      <w:pPr>
+        <w:rPr>
+          <w:lang w:val="en-US"/>
+        </w:rPr>
+      </w:pPr>
+      <w:r>
+        <w:rPr>
+          <w:lang w:val="en-US"/>
+        </w:rPr>
+        <w:t>For multiple rogues</w:t>
+      </w:r>
+      <w:r>
+        <w:rPr>
+          <w:lang w:val="en-US"/>
+        </w:rPr>
+        <w:t>, I added basic</w:t>
+      </w:r>
+      <w:r>
+        <w:rPr>
+          <w:lang w:val="en-US"/>
+        </w:rPr>
+        <w:t xml:space="preserve"> communication.</w:t>
+      </w:r>
+      <w:r>
+        <w:rPr>
+          <w:lang w:val="en-US"/>
+        </w:rPr>
+        <w:t xml:space="preserve"> Each rogue writes a simple</w:t>
+      </w:r>
+      <w:r>
+        <w:rPr>
+          <w:lang w:val="en-US"/>
+        </w:rPr>
+        <w:t xml:space="preserve"> status signal</w:t>
+      </w:r>
+      <w:r>
+        <w:rPr>
+          <w:lang w:val="en-US"/>
+        </w:rPr>
+        <w:t xml:space="preserve"> into the shared</w:t>
+      </w:r>
+      <w:r>
+        <w:rPr>
+          <w:lang w:val="en-US"/>
+        </w:rPr>
+        <w:t xml:space="preserve"> communication array.</w:t>
+      </w:r>
+      <w:r>
+        <w:rPr>
+          <w:lang w:val="en-US"/>
+        </w:rPr>
+        <w:t xml:space="preserve"> The signal indicates</w:t>
+      </w:r>
+      <w:r>
+        <w:rPr>
+          <w:lang w:val="en-US"/>
+        </w:rPr>
+        <w:t xml:space="preserve"> whether the rogue is exploring</w:t>
+      </w:r>
+      <w:r>
+        <w:rPr>
+          <w:lang w:val="en-US"/>
+        </w:rPr>
+        <w:t>, knows about</w:t>
+      </w:r>
+      <w:r>
+        <w:rPr>
+          <w:lang w:val="en-US"/>
+        </w:rPr>
+        <w:t xml:space="preserve"> treasure</w:t>
+      </w:r>
+      <w:r>
+        <w:rPr>
+          <w:lang w:val="en-US"/>
+        </w:rPr>
+        <w:t>, is standing on treasure</w:t>
+      </w:r>
+      <w:r>
+        <w:rPr>
+          <w:lang w:val="en-US"/>
+        </w:rPr>
+        <w:t>, or has a nearby trap.</w:t>
+      </w:r>
+      <w:r>
+        <w:rPr>
+          <w:lang w:val="en-US"/>
+        </w:rPr>
+        <w:t xml:space="preserve"> The AI also uses</w:t>
+      </w:r>
+      <w:r>
+        <w:rPr>
+          <w:lang w:val="en-US"/>
+        </w:rPr>
+        <w:t xml:space="preserve"> relative positions</w:t>
+      </w:r>
+      <w:r>
+        <w:rPr>
+          <w:lang w:val="en-US"/>
+        </w:rPr>
+        <w:t xml:space="preserve"> of other rogues</w:t>
+      </w:r>
+      <w:r>
+        <w:rPr>
+          <w:lang w:val="en-US"/>
+        </w:rPr>
+        <w:t xml:space="preserve"> to avoid moving into</w:t>
+      </w:r>
+      <w:r>
+        <w:rPr>
+          <w:lang w:val="en-US"/>
+        </w:rPr>
+        <w:t xml:space="preserve"> their cells or</w:t>
+      </w:r>
+      <w:r>
+        <w:rPr>
+          <w:lang w:val="en-US"/>
+        </w:rPr>
+        <w:t xml:space="preserve"> planning paths</w:t>
+      </w:r>
+      <w:r>
+        <w:rPr>
+          <w:lang w:val="en-US"/>
+        </w:rPr>
+        <w:t xml:space="preserve"> through them.</w:t>
+      </w:r>
+    </w:p>
+    <w:p>
+      <w:pPr>
+        <w:rPr>
+          <w:lang w:val="en-US"/>
+        </w:rPr>
+      </w:pPr>
+    </w:p>
+    <w:p>
+      <w:pPr>
+        <w:rPr>
+          <w:lang w:val="en-US"/>
+        </w:rPr>
+      </w:pPr>
+      <w:r>
+        <w:rPr>
+          <w:lang w:val="en-US"/>
+        </w:rPr>
+        <w:t>Teleporters are treated as</w:t>
+      </w:r>
+      <w:r>
+        <w:rPr>
+          <w:lang w:val="en-US"/>
+        </w:rPr>
+        <w:t xml:space="preserve"> passable cells</w:t>
+      </w:r>
+      <w:r>
+        <w:rPr>
+          <w:lang w:val="en-US"/>
+        </w:rPr>
+        <w:t xml:space="preserve"> in the current ve</w:t>
+      </w:r>
+      <w:r>
+        <w:rPr>
+          <w:lang w:val="en-US"/>
+        </w:rPr>
+        <w:t>r</w:t>
+      </w:r>
+      <w:r>
+        <w:rPr>
+          <w:lang w:val="en-US"/>
+        </w:rPr>
+        <w:t>sion</w:t>
+      </w:r>
+      <w:r>
+        <w:rPr>
+          <w:lang w:val="en-US"/>
+        </w:rPr>
+        <w:t>.</w:t>
+      </w:r>
+      <w:r>
+        <w:rPr>
+          <w:lang w:val="en-US"/>
+        </w:rPr>
+        <w:t xml:space="preserve"> The AI does not deeply</w:t>
+      </w:r>
+      <w:r>
+        <w:rPr>
+          <w:lang w:val="en-US"/>
+        </w:rPr>
+        <w:t xml:space="preserve"> learn teleporter</w:t>
+      </w:r>
+      <w:r>
+        <w:rPr>
+          <w:lang w:val="en-US"/>
+        </w:rPr>
+        <w:t xml:space="preserve"> links yet,</w:t>
+      </w:r>
+      <w:r>
+        <w:rPr>
+          <w:lang w:val="en-US"/>
+        </w:rPr>
+        <w:t xml:space="preserve"> which is one of the</w:t>
+      </w:r>
+      <w:r>
+        <w:rPr>
+          <w:lang w:val="en-US"/>
+        </w:rPr>
+        <w:t xml:space="preserve"> limitations of the solution.</w:t>
+      </w:r>
+    </w:p>
+    <w:p>
+      <w:pPr>
+        <w:rPr>
+          <w:lang w:val="en-US"/>
+        </w:rPr>
+      </w:pPr>
+    </w:p>
+    <w:p>
+      <w:pPr>
+        <w:pStyle w:val="ListParagraph"/>
+        <w:numPr>
+          <w:ilvl w:val="0"/>
+          <w:numId w:val="2"/>
+        </w:numPr>
+        <w:rPr>
+          <w:lang w:val="en-US"/>
+        </w:rPr>
+      </w:pPr>
+      <w:r>
+        <w:rPr>
+          <w:lang w:val="en-US"/>
+        </w:rPr>
+        <w:lastRenderedPageBreak/>
+        <w:t>Behavior-Level</w:t>
+      </w:r>
+      <w:r>
+        <w:rPr>
+          <w:lang w:val="en-US"/>
+        </w:rPr>
+        <w:t xml:space="preserve"> Problems and Limitations</w:t>
+      </w:r>
+    </w:p>
+    <w:p>
+      <w:pPr>
+        <w:rPr>
+          <w:lang w:val="en-US"/>
+        </w:rPr>
+      </w:pPr>
+    </w:p>
+    <w:p>
+      <w:pPr>
+        <w:rPr>
+          <w:lang w:val="en-US"/>
+        </w:rPr>
+      </w:pPr>
+      <w:r>
+        <w:rPr>
+          <w:lang w:val="en-US"/>
+        </w:rPr>
+        <w:t>The AI is more structured</w:t>
+      </w:r>
+      <w:r>
+        <w:rPr>
+          <w:lang w:val="en-US"/>
+        </w:rPr>
+        <w:t xml:space="preserve"> than a random solution</w:t>
+      </w:r>
+      <w:r>
+        <w:rPr>
+          <w:lang w:val="en-US"/>
+        </w:rPr>
+        <w:t>, but it still has</w:t>
+      </w:r>
+      <w:r>
+        <w:rPr>
+          <w:lang w:val="en-US"/>
+        </w:rPr>
+        <w:t xml:space="preserve"> several behavior-level weaknesses.</w:t>
+      </w:r>
+    </w:p>
+    <w:p>
+      <w:pPr>
+        <w:rPr>
+          <w:lang w:val="en-US"/>
+        </w:rPr>
+      </w:pPr>
+    </w:p>
+    <w:p>
+      <w:pPr>
+        <w:rPr>
+          <w:lang w:val="en-US"/>
+        </w:rPr>
+      </w:pPr>
+      <w:r>
+        <w:rPr>
+          <w:lang w:val="en-US"/>
+        </w:rPr>
+        <w:t>First, trap reasoning</w:t>
+      </w:r>
+      <w:r>
+        <w:rPr>
+          <w:lang w:val="en-US"/>
+        </w:rPr>
+        <w:t xml:space="preserve"> is imperfect.</w:t>
+      </w:r>
+      <w:r>
+        <w:rPr>
+          <w:lang w:val="en-US"/>
+        </w:rPr>
+        <w:t xml:space="preserve"> The detector gives</w:t>
+      </w:r>
+      <w:r>
+        <w:rPr>
+          <w:lang w:val="en-US"/>
+        </w:rPr>
+        <w:t xml:space="preserve"> the distance to</w:t>
+      </w:r>
+      <w:r>
+        <w:rPr>
+          <w:lang w:val="en-US"/>
+        </w:rPr>
+        <w:t xml:space="preserve"> the nearest trap</w:t>
+      </w:r>
+      <w:r>
+        <w:rPr>
+          <w:lang w:val="en-US"/>
+        </w:rPr>
+        <w:t>, but not the exact</w:t>
+      </w:r>
+      <w:r>
+        <w:rPr>
+          <w:lang w:val="en-US"/>
+        </w:rPr>
+        <w:t xml:space="preserve"> location.</w:t>
+      </w:r>
+      <w:r>
+        <w:rPr>
+          <w:lang w:val="en-US"/>
+        </w:rPr>
+        <w:t xml:space="preserve"> The AI uses</w:t>
+      </w:r>
+      <w:r>
+        <w:rPr>
+          <w:lang w:val="en-US"/>
+        </w:rPr>
+        <w:t xml:space="preserve"> suspicion</w:t>
+      </w:r>
+      <w:r>
+        <w:rPr>
+          <w:lang w:val="en-US"/>
+        </w:rPr>
+        <w:t xml:space="preserve"> scores</w:t>
+      </w:r>
+      <w:r>
+        <w:rPr>
+          <w:lang w:val="en-US"/>
+        </w:rPr>
+        <w:t xml:space="preserve"> and safe-cell marking</w:t>
+      </w:r>
+      <w:r>
+        <w:rPr>
+          <w:lang w:val="en-US"/>
+        </w:rPr>
+        <w:t>, but it does not fully</w:t>
+      </w:r>
+      <w:r>
+        <w:rPr>
+          <w:lang w:val="en-US"/>
+        </w:rPr>
+        <w:t xml:space="preserve"> solve all</w:t>
+      </w:r>
+      <w:r>
+        <w:rPr>
+          <w:lang w:val="en-US"/>
+        </w:rPr>
+        <w:t xml:space="preserve"> possible trap</w:t>
+      </w:r>
+      <w:r>
+        <w:rPr>
+          <w:lang w:val="en-US"/>
+        </w:rPr>
+        <w:t xml:space="preserve"> configurations.</w:t>
+      </w:r>
+      <w:r>
+        <w:rPr>
+          <w:lang w:val="en-US"/>
+        </w:rPr>
+        <w:t xml:space="preserve"> This means it can sometimes</w:t>
+      </w:r>
+      <w:r>
+        <w:rPr>
+          <w:lang w:val="en-US"/>
+        </w:rPr>
+        <w:t xml:space="preserve"> be too</w:t>
+      </w:r>
+      <w:r>
+        <w:rPr>
+          <w:lang w:val="en-US"/>
+        </w:rPr>
+        <w:t xml:space="preserve"> cautious</w:t>
+      </w:r>
+      <w:r>
+        <w:rPr>
+          <w:lang w:val="en-US"/>
+        </w:rPr>
+        <w:t xml:space="preserve"> or suspicious</w:t>
+      </w:r>
+      <w:r>
+        <w:rPr>
+          <w:lang w:val="en-US"/>
+        </w:rPr>
+        <w:t xml:space="preserve"> of cells that are</w:t>
+      </w:r>
+      <w:r>
+        <w:rPr>
+          <w:lang w:val="en-US"/>
+        </w:rPr>
+        <w:t xml:space="preserve"> actually safe.</w:t>
+      </w:r>
+    </w:p>
+    <w:p>
+      <w:pPr>
+        <w:rPr>
+          <w:lang w:val="en-US"/>
+        </w:rPr>
+      </w:pPr>
+    </w:p>
+    <w:p>
+      <w:pPr>
+        <w:rPr>
+          <w:lang w:val="en-US"/>
+        </w:rPr>
+      </w:pPr>
+      <w:r>
+        <w:rPr>
+          <w:lang w:val="en-US"/>
+        </w:rPr>
+        <w:t>Se</w:t>
+      </w:r>
+      <w:r>
+        <w:rPr>
+          <w:lang w:val="en-US"/>
+        </w:rPr>
+        <w:t xml:space="preserve">cond, </w:t>
+      </w:r>
+      <w:r>
+        <w:rPr>
+          <w:lang w:val="en-US"/>
+        </w:rPr>
+        <w:t>exploration is still simple</w:t>
+      </w:r>
+      <w:r>
+        <w:rPr>
+          <w:lang w:val="en-US"/>
+        </w:rPr>
+        <w:t>.</w:t>
+      </w:r>
+      <w:r>
+        <w:rPr>
+          <w:lang w:val="en-US"/>
+        </w:rPr>
+        <w:t xml:space="preserve"> If the rogue does not know</w:t>
+      </w:r>
+      <w:r>
+        <w:rPr>
+          <w:lang w:val="en-US"/>
+        </w:rPr>
+        <w:t xml:space="preserve"> where treasure is</w:t>
+      </w:r>
+      <w:r>
+        <w:rPr>
+          <w:lang w:val="en-US"/>
+        </w:rPr>
+        <w:t>, it mostly tries</w:t>
+      </w:r>
+      <w:r>
+        <w:rPr>
+          <w:lang w:val="en-US"/>
+        </w:rPr>
+        <w:t xml:space="preserve"> to move forward</w:t>
+      </w:r>
+      <w:r>
+        <w:rPr>
+          <w:lang w:val="en-US"/>
+        </w:rPr>
+        <w:t xml:space="preserve"> safely</w:t>
+      </w:r>
+      <w:r>
+        <w:rPr>
+          <w:lang w:val="en-US"/>
+        </w:rPr>
+        <w:t xml:space="preserve"> and turns</w:t>
+      </w:r>
+      <w:r>
+        <w:rPr>
+          <w:lang w:val="en-US"/>
+        </w:rPr>
+        <w:t xml:space="preserve"> when blocked.</w:t>
+      </w:r>
+      <w:r>
+        <w:rPr>
+          <w:lang w:val="en-US"/>
+        </w:rPr>
+        <w:t xml:space="preserve"> This can discover</w:t>
+      </w:r>
+      <w:r>
+        <w:rPr>
+          <w:lang w:val="en-US"/>
+        </w:rPr>
+        <w:t xml:space="preserve"> new areas</w:t>
+      </w:r>
+      <w:r>
+        <w:rPr>
+          <w:lang w:val="en-US"/>
+        </w:rPr>
+        <w:t>, but it is not optimal</w:t>
+      </w:r>
+      <w:r>
+        <w:rPr>
+          <w:lang w:val="en-US"/>
+        </w:rPr>
+        <w:t>.</w:t>
+      </w:r>
+      <w:r>
+        <w:rPr>
+          <w:lang w:val="en-US"/>
+        </w:rPr>
+        <w:t xml:space="preserve"> The rogue</w:t>
+      </w:r>
+      <w:r>
+        <w:rPr>
+          <w:lang w:val="en-US"/>
+        </w:rPr>
+        <w:t xml:space="preserve"> can waste time revisiting</w:t>
+      </w:r>
+      <w:r>
+        <w:rPr>
+          <w:lang w:val="en-US"/>
+        </w:rPr>
+        <w:t xml:space="preserve"> known areas.</w:t>
+      </w:r>
+      <w:r>
+        <w:rPr>
+          <w:lang w:val="en-US"/>
+        </w:rPr>
+        <w:t xml:space="preserve"> A better version would</w:t>
+      </w:r>
+      <w:r>
+        <w:rPr>
+          <w:lang w:val="en-US"/>
+        </w:rPr>
+        <w:t xml:space="preserve"> search for</w:t>
+      </w:r>
+      <w:r>
+        <w:rPr>
+          <w:lang w:val="en-US"/>
+        </w:rPr>
+        <w:t xml:space="preserve"> frontier cells</w:t>
+      </w:r>
+      <w:r>
+        <w:rPr>
+          <w:lang w:val="en-US"/>
+        </w:rPr>
+        <w:t>, meaning known positions</w:t>
+      </w:r>
+      <w:r>
+        <w:rPr>
+          <w:lang w:val="en-US"/>
+        </w:rPr>
+        <w:t xml:space="preserve"> near unexplored </w:t>
+      </w:r>
+      <w:r>
+        <w:rPr>
+          <w:lang w:val="en-US"/>
+        </w:rPr>
+        <w:t>territory</w:t>
+      </w:r>
+      <w:r>
+        <w:rPr>
+          <w:lang w:val="en-US"/>
+        </w:rPr>
+        <w:t>, and use BFS</w:t>
+      </w:r>
+      <w:r>
+        <w:rPr>
+          <w:lang w:val="en-US"/>
+        </w:rPr>
+        <w:t xml:space="preserve"> to move toward them</w:t>
+      </w:r>
+      <w:r>
+        <w:rPr>
+          <w:lang w:val="en-US"/>
+        </w:rPr>
+        <w:t>.</w:t>
+      </w:r>
+    </w:p>
+    <w:p>
+      <w:pPr>
+        <w:rPr>
+          <w:lang w:val="en-US"/>
+        </w:rPr>
+      </w:pPr>
+    </w:p>
+    <w:p>
+      <w:pPr>
+        <w:rPr>
+          <w:lang w:val="en-US"/>
+        </w:rPr>
+      </w:pPr>
+      <w:r>
+        <w:rPr>
+          <w:lang w:val="en-US"/>
+        </w:rPr>
+        <w:t>Third, the</w:t>
+      </w:r>
+      <w:r>
+        <w:rPr>
+          <w:lang w:val="en-US"/>
+        </w:rPr>
+        <w:t xml:space="preserve"> AI does not</w:t>
+      </w:r>
+      <w:r>
+        <w:rPr>
+          <w:lang w:val="en-US"/>
+        </w:rPr>
+        <w:t xml:space="preserve"> fully use teleporters.</w:t>
+      </w:r>
+      <w:r>
+        <w:rPr>
+          <w:lang w:val="en-US"/>
+        </w:rPr>
+        <w:t xml:space="preserve"> It can walk onto teleporter cells</w:t>
+      </w:r>
+      <w:r>
+        <w:rPr>
+          <w:lang w:val="en-US"/>
+        </w:rPr>
+        <w:t>, but it does not yet</w:t>
+      </w:r>
+      <w:r>
+        <w:rPr>
+          <w:lang w:val="en-US"/>
+        </w:rPr>
+        <w:t xml:space="preserve"> learn</w:t>
+      </w:r>
+      <w:r>
+        <w:rPr>
+          <w:lang w:val="en-US"/>
+        </w:rPr>
+        <w:t xml:space="preserve"> where each teleporter</w:t>
+      </w:r>
+      <w:r>
+        <w:rPr>
+          <w:lang w:val="en-US"/>
+        </w:rPr>
+        <w:t xml:space="preserve"> sends the rogue</w:t>
+      </w:r>
+      <w:r>
+        <w:rPr>
+          <w:lang w:val="en-US"/>
+        </w:rPr>
+        <w:t>.</w:t>
+      </w:r>
+      <w:r>
+        <w:rPr>
+          <w:lang w:val="en-US"/>
+        </w:rPr>
+        <w:t xml:space="preserve"> A stronger version would</w:t>
+      </w:r>
+      <w:r>
+        <w:rPr>
+          <w:lang w:val="en-US"/>
+        </w:rPr>
+        <w:t xml:space="preserve"> remember teleporter links</w:t>
+      </w:r>
+      <w:r>
+        <w:rPr>
+          <w:lang w:val="en-US"/>
+        </w:rPr>
+        <w:t xml:space="preserve"> and include them</w:t>
+      </w:r>
+      <w:r>
+        <w:rPr>
+          <w:lang w:val="en-US"/>
+        </w:rPr>
+        <w:t xml:space="preserve"> as special edges</w:t>
+      </w:r>
+      <w:r>
+        <w:rPr>
+          <w:lang w:val="en-US"/>
+        </w:rPr>
+        <w:t xml:space="preserve"> in the pathfinding graph.</w:t>
+      </w:r>
+    </w:p>
+    <w:p>
+      <w:pPr>
+        <w:rPr>
+          <w:lang w:val="en-US"/>
+        </w:rPr>
+      </w:pPr>
+    </w:p>
+    <w:p>
+      <w:pPr>
+        <w:rPr>
+          <w:lang w:val="en-US"/>
+        </w:rPr>
+      </w:pPr>
+      <w:r>
+        <w:rPr>
+          <w:lang w:val="en-US"/>
+        </w:rPr>
+        <w:t xml:space="preserve">Fourth, </w:t>
+      </w:r>
+      <w:r>
+        <w:rPr>
+          <w:lang w:val="en-US"/>
+        </w:rPr>
+        <w:t>multi-agent communication</w:t>
+      </w:r>
+      <w:r>
+        <w:rPr>
+          <w:lang w:val="en-US"/>
+        </w:rPr>
+        <w:t xml:space="preserve"> is basic.</w:t>
+      </w:r>
+      <w:r>
+        <w:rPr>
+          <w:lang w:val="en-US"/>
+        </w:rPr>
+        <w:t xml:space="preserve"> The rogues share status</w:t>
+      </w:r>
+      <w:r>
+        <w:rPr>
+          <w:lang w:val="en-US"/>
+        </w:rPr>
+        <w:t xml:space="preserve"> signals</w:t>
+      </w:r>
+      <w:r>
+        <w:rPr>
+          <w:lang w:val="en-US"/>
+        </w:rPr>
+        <w:t>, but they do not merge</w:t>
+      </w:r>
+      <w:r>
+        <w:rPr>
+          <w:lang w:val="en-US"/>
+        </w:rPr>
+        <w:t xml:space="preserve"> their full maps.</w:t>
+      </w:r>
+      <w:r>
+        <w:rPr>
+          <w:lang w:val="en-US"/>
+        </w:rPr>
+        <w:t xml:space="preserve"> I avoided full map sharing</w:t>
+      </w:r>
+      <w:r>
+        <w:rPr>
+          <w:lang w:val="en-US"/>
+        </w:rPr>
+        <w:t xml:space="preserve"> because each rogue</w:t>
+      </w:r>
+      <w:r>
+        <w:rPr>
+          <w:lang w:val="en-US"/>
+        </w:rPr>
+        <w:t xml:space="preserve"> can have a different</w:t>
+      </w:r>
+      <w:r>
+        <w:rPr>
+          <w:lang w:val="en-US"/>
+        </w:rPr>
+        <w:t xml:space="preserve"> internal coordinate</w:t>
+      </w:r>
+      <w:r>
+        <w:rPr>
+          <w:lang w:val="en-US"/>
+        </w:rPr>
+        <w:t xml:space="preserve"> system depending on</w:t>
+      </w:r>
+      <w:r>
+        <w:rPr>
+          <w:lang w:val="en-US"/>
+        </w:rPr>
+        <w:t xml:space="preserve"> starting position</w:t>
+      </w:r>
+      <w:r>
+        <w:rPr>
+          <w:lang w:val="en-US"/>
+        </w:rPr>
+        <w:t xml:space="preserve"> and heading.</w:t>
+      </w:r>
+      <w:r>
+        <w:rPr>
+          <w:lang w:val="en-US"/>
+        </w:rPr>
+        <w:t xml:space="preserve"> Sharing maps without</w:t>
+      </w:r>
+      <w:r>
+        <w:rPr>
+          <w:lang w:val="en-US"/>
+        </w:rPr>
+        <w:t xml:space="preserve"> aligning</w:t>
+      </w:r>
+      <w:r>
+        <w:rPr>
+          <w:lang w:val="en-US"/>
+        </w:rPr>
+        <w:t xml:space="preserve"> coordinate</w:t>
+      </w:r>
+      <w:r>
+        <w:rPr>
+          <w:lang w:val="en-US"/>
+        </w:rPr>
+        <w:t xml:space="preserve"> systems could</w:t>
+      </w:r>
+      <w:r>
+        <w:rPr>
+          <w:lang w:val="en-US"/>
+        </w:rPr>
+        <w:t xml:space="preserve"> create incorrect information.</w:t>
+      </w:r>
+    </w:p>
+    <w:p>
+      <w:pPr>
+        <w:rPr>
+          <w:lang w:val="en-US"/>
+        </w:rPr>
+      </w:pPr>
+    </w:p>
+    <w:p>
+      <w:pPr>
+        <w:rPr>
+          <w:lang w:val="en-US"/>
+        </w:rPr>
+      </w:pPr>
+      <w:r>
+        <w:rPr>
+          <w:lang w:val="en-US"/>
+        </w:rPr>
+        <w:t xml:space="preserve">Finally, </w:t>
+      </w:r>
+      <w:r>
+        <w:rPr>
+          <w:lang w:val="en-US"/>
+        </w:rPr>
+        <w:t>the AI assumes</w:t>
+      </w:r>
+      <w:r>
+        <w:rPr>
+          <w:lang w:val="en-US"/>
+        </w:rPr>
+        <w:t xml:space="preserve"> that actions usually succeed</w:t>
+      </w:r>
+      <w:r>
+        <w:rPr>
+          <w:lang w:val="en-US"/>
+        </w:rPr>
+        <w:t>.</w:t>
+      </w:r>
+      <w:r>
+        <w:rPr>
+          <w:lang w:val="en-US"/>
+        </w:rPr>
+        <w:t xml:space="preserve"> If slip chance is enabled</w:t>
+      </w:r>
+      <w:r>
+        <w:rPr>
+          <w:lang w:val="en-US"/>
+        </w:rPr>
+        <w:t>, then the</w:t>
+      </w:r>
+      <w:r>
+        <w:rPr>
+          <w:lang w:val="en-US"/>
+        </w:rPr>
+        <w:t xml:space="preserve"> rogue would</w:t>
+      </w:r>
+      <w:r>
+        <w:rPr>
+          <w:lang w:val="en-US"/>
+        </w:rPr>
+        <w:t xml:space="preserve"> need to verify</w:t>
+      </w:r>
+      <w:r>
+        <w:rPr>
+          <w:lang w:val="en-US"/>
+        </w:rPr>
+        <w:t xml:space="preserve"> whether its last</w:t>
+      </w:r>
+      <w:r>
+        <w:rPr>
+          <w:lang w:val="en-US"/>
+        </w:rPr>
+        <w:t xml:space="preserve"> action actually</w:t>
+      </w:r>
+      <w:r>
+        <w:rPr>
+          <w:lang w:val="en-US"/>
+        </w:rPr>
+        <w:t xml:space="preserve"> happened before</w:t>
+      </w:r>
+      <w:r>
+        <w:rPr>
+          <w:lang w:val="en-US"/>
+        </w:rPr>
+        <w:t xml:space="preserve"> updating</w:t>
+      </w:r>
+      <w:r>
+        <w:rPr>
+          <w:lang w:val="en-US"/>
+        </w:rPr>
+        <w:t xml:space="preserve"> its internal map</w:t>
+      </w:r>
+      <w:r>
+        <w:rPr>
+          <w:lang w:val="en-US"/>
+        </w:rPr>
+        <w:t>.</w:t>
+      </w:r>
+      <w:r>
+        <w:rPr>
+          <w:lang w:val="en-US"/>
+        </w:rPr>
+        <w:t xml:space="preserve"> The current solution is</w:t>
+      </w:r>
+      <w:r>
+        <w:rPr>
+          <w:lang w:val="en-US"/>
+        </w:rPr>
+        <w:t xml:space="preserve"> mainly designed for</w:t>
+      </w:r>
+      <w:r>
+        <w:rPr>
+          <w:lang w:val="en-US"/>
+        </w:rPr>
+        <w:t xml:space="preserve"> the normal case</w:t>
+      </w:r>
+      <w:r>
+        <w:rPr>
+          <w:lang w:val="en-US"/>
+        </w:rPr>
+        <w:t xml:space="preserve"> where movement</w:t>
+      </w:r>
+      <w:r>
+        <w:rPr>
+          <w:lang w:val="en-US"/>
+        </w:rPr>
+        <w:t xml:space="preserve"> and turning work reliably</w:t>
+      </w:r>
+      <w:r>
+        <w:rPr>
+          <w:lang w:val="en-US"/>
+        </w:rPr>
+        <w:t>.</w:t>
+      </w:r>
+    </w:p>
+    <w:p>
+      <w:pPr>
+        <w:rPr>
+          <w:lang w:val="en-US"/>
+        </w:rPr>
+      </w:pPr>
+    </w:p>
+    <w:p>
+      <w:pPr>
+        <w:pStyle w:val="ListParagraph"/>
+        <w:numPr>
+          <w:ilvl w:val="0"/>
+          <w:numId w:val="2"/>
+        </w:numPr>
+        <w:rPr>
+          <w:lang w:val="en-US"/>
+        </w:rPr>
+      </w:pPr>
+      <w:r>
+        <w:rPr>
+          <w:lang w:val="en-US"/>
+        </w:rPr>
+        <w:t>After</w:t>
+      </w:r>
+      <w:r>
+        <w:rPr>
+          <w:lang w:val="en-US"/>
+        </w:rPr>
+        <w:t>-Action Report</w:t>
+      </w:r>
+    </w:p>
+    <w:p>
+      <w:pPr>
+        <w:rPr>
+          <w:lang w:val="en-US"/>
+        </w:rPr>
+      </w:pPr>
+    </w:p>
+    <w:p>
+      <w:pPr>
+        <w:rPr>
+          <w:lang w:val="en-US"/>
+        </w:rPr>
+      </w:pPr>
+      <w:r>
+        <w:rPr>
+          <w:lang w:val="en-US"/>
+        </w:rPr>
+        <w:t>At the beginning, the project felt</w:t>
+      </w:r>
+      <w:r>
+        <w:rPr>
+          <w:lang w:val="en-US"/>
+        </w:rPr>
+        <w:t xml:space="preserve"> overwhelming</w:t>
+      </w:r>
+      <w:r>
+        <w:rPr>
+          <w:lang w:val="en-US"/>
+        </w:rPr>
+        <w:t xml:space="preserve"> because there were many problems</w:t>
+      </w:r>
+      <w:r>
+        <w:rPr>
+          <w:lang w:val="en-US"/>
+        </w:rPr>
+        <w:t xml:space="preserve"> at once: </w:t>
+      </w:r>
+      <w:r>
+        <w:rPr>
+          <w:lang w:val="en-US"/>
+        </w:rPr>
+        <w:t>hidden traps</w:t>
+      </w:r>
+      <w:r>
+        <w:rPr>
+          <w:lang w:val="en-US"/>
+        </w:rPr>
+        <w:t>, treasures</w:t>
+      </w:r>
+      <w:r>
+        <w:rPr>
+          <w:lang w:val="en-US"/>
+        </w:rPr>
+        <w:t>, walls,</w:t>
+      </w:r>
+      <w:r>
+        <w:rPr>
+          <w:lang w:val="en-US"/>
+        </w:rPr>
+        <w:t xml:space="preserve"> limited vision</w:t>
+      </w:r>
+      <w:r>
+        <w:rPr>
+          <w:lang w:val="en-US"/>
+        </w:rPr>
+        <w:t>, teleporters</w:t>
+      </w:r>
+      <w:r>
+        <w:rPr>
+          <w:lang w:val="en-US"/>
+        </w:rPr>
+        <w:t>, multiple rogues</w:t>
+      </w:r>
+      <w:r>
+        <w:rPr>
+          <w:lang w:val="en-US"/>
+        </w:rPr>
+        <w:t>, and scoring.</w:t>
+      </w:r>
+      <w:r>
+        <w:rPr>
+          <w:lang w:val="en-US"/>
+        </w:rPr>
+        <w:t xml:space="preserve"> Trying to solve</w:t>
+      </w:r>
+      <w:r>
+        <w:rPr>
+          <w:lang w:val="en-US"/>
+        </w:rPr>
+        <w:t xml:space="preserve"> everything immediately</w:t>
+      </w:r>
+      <w:r>
+        <w:rPr>
+          <w:lang w:val="en-US"/>
+        </w:rPr>
+        <w:t xml:space="preserve"> would have been </w:t>
+      </w:r>
+      <w:r>
+        <w:rPr>
+          <w:lang w:val="en-US"/>
+        </w:rPr>
+        <w:t>too complicated.</w:t>
+      </w:r>
+    </w:p>
+    <w:p>
+      <w:pPr>
+        <w:rPr>
+          <w:lang w:val="en-US"/>
+        </w:rPr>
+      </w:pPr>
+    </w:p>
+    <w:p>
+      <w:pPr>
+        <w:rPr>
+          <w:lang w:val="en-US"/>
+        </w:rPr>
+      </w:pPr>
+      <w:r>
+        <w:rPr>
+          <w:lang w:val="en-US"/>
+        </w:rPr>
+        <w:t>The best approach was to divide</w:t>
+      </w:r>
+      <w:r>
+        <w:rPr>
+          <w:lang w:val="en-US"/>
+        </w:rPr>
+        <w:t xml:space="preserve"> the project into smaller stages.</w:t>
+      </w:r>
+      <w:r>
+        <w:rPr>
+          <w:lang w:val="en-US"/>
+        </w:rPr>
+        <w:t xml:space="preserve"> First, I made </w:t>
+      </w:r>
+      <w:r>
+        <w:rPr>
+          <w:lang w:val="en-US"/>
+        </w:rPr>
+        <w:t xml:space="preserve">a </w:t>
+      </w:r>
+      <w:r>
+        <w:rPr>
+          <w:lang w:val="en-US"/>
+        </w:rPr>
+        <w:t>simple</w:t>
+      </w:r>
+      <w:r>
+        <w:rPr>
+          <w:lang w:val="en-US"/>
+        </w:rPr>
+        <w:t xml:space="preserve"> survival AI</w:t>
+      </w:r>
+      <w:r>
+        <w:rPr>
+          <w:lang w:val="en-US"/>
+        </w:rPr>
+        <w:t xml:space="preserve"> that </w:t>
+      </w:r>
+      <w:r>
+        <w:rPr>
+          <w:lang w:val="en-US"/>
+        </w:rPr>
+        <w:t>could take treasure</w:t>
+      </w:r>
+      <w:r>
+        <w:rPr>
+          <w:lang w:val="en-US"/>
+        </w:rPr>
+        <w:t>, avoid walls</w:t>
+      </w:r>
+      <w:r>
+        <w:rPr>
+          <w:lang w:val="en-US"/>
+        </w:rPr>
+        <w:t>, and react to nearby traps</w:t>
+      </w:r>
+      <w:r>
+        <w:rPr>
+          <w:lang w:val="en-US"/>
+        </w:rPr>
+        <w:t>.</w:t>
+      </w:r>
+      <w:r>
+        <w:rPr>
+          <w:lang w:val="en-US"/>
+        </w:rPr>
+        <w:t xml:space="preserve"> Then I added internal</w:t>
+      </w:r>
+      <w:r>
+        <w:rPr>
+          <w:lang w:val="en-US"/>
+        </w:rPr>
+        <w:t xml:space="preserve"> memory and a map</w:t>
+      </w:r>
+      <w:r>
+        <w:rPr>
+          <w:lang w:val="en-US"/>
+        </w:rPr>
+        <w:t>.</w:t>
+      </w:r>
+      <w:r>
+        <w:rPr>
+          <w:lang w:val="en-US"/>
+        </w:rPr>
+        <w:t xml:space="preserve"> After that, I added BFS</w:t>
+      </w:r>
+      <w:r>
+        <w:rPr>
+          <w:lang w:val="en-US"/>
+        </w:rPr>
+        <w:t xml:space="preserve"> pathfinding</w:t>
+      </w:r>
+      <w:r>
+        <w:rPr>
+          <w:lang w:val="en-US"/>
+        </w:rPr>
+        <w:t xml:space="preserve"> so the rogue could</w:t>
+      </w:r>
+      <w:r>
+        <w:rPr>
+          <w:lang w:val="en-US"/>
+        </w:rPr>
+        <w:t xml:space="preserve"> move toward</w:t>
+      </w:r>
+      <w:r>
+        <w:rPr>
+          <w:lang w:val="en-US"/>
+        </w:rPr>
+        <w:t xml:space="preserve"> known treasures</w:t>
+      </w:r>
+      <w:r>
+        <w:rPr>
+          <w:lang w:val="en-US"/>
+        </w:rPr>
+        <w:t xml:space="preserve"> </w:t>
+      </w:r>
+      <w:r>
+        <w:rPr>
+          <w:lang w:val="en-US"/>
+        </w:rPr>
+        <w:lastRenderedPageBreak/>
+        <w:t>instead of only</w:t>
+      </w:r>
+      <w:r>
+        <w:rPr>
+          <w:lang w:val="en-US"/>
+        </w:rPr>
+        <w:t xml:space="preserve"> reacting to what it currently sees</w:t>
+      </w:r>
+      <w:r>
+        <w:rPr>
+          <w:lang w:val="en-US"/>
+        </w:rPr>
+        <w:t>. Then I improved</w:t>
+      </w:r>
+      <w:r>
+        <w:rPr>
+          <w:lang w:val="en-US"/>
+        </w:rPr>
+        <w:t xml:space="preserve"> the trap logic</w:t>
+      </w:r>
+      <w:r>
+        <w:rPr>
+          <w:lang w:val="en-US"/>
+        </w:rPr>
+        <w:t xml:space="preserve"> by using the</w:t>
+      </w:r>
+      <w:r>
+        <w:rPr>
+          <w:lang w:val="en-US"/>
+        </w:rPr>
+        <w:t xml:space="preserve"> detector value</w:t>
+      </w:r>
+      <w:r>
+        <w:rPr>
+          <w:lang w:val="en-US"/>
+        </w:rPr>
+        <w:t xml:space="preserve"> to mark cells</w:t>
+      </w:r>
+      <w:r>
+        <w:rPr>
+          <w:lang w:val="en-US"/>
+        </w:rPr>
+        <w:t xml:space="preserve"> as safe or suspicious.</w:t>
+      </w:r>
+      <w:r>
+        <w:rPr>
+          <w:lang w:val="en-US"/>
+        </w:rPr>
+        <w:t xml:space="preserve"> Finally, I added</w:t>
+      </w:r>
+      <w:r>
+        <w:rPr>
+          <w:lang w:val="en-US"/>
+        </w:rPr>
+        <w:t xml:space="preserve"> simple</w:t>
+      </w:r>
+      <w:r>
+        <w:rPr>
+          <w:lang w:val="en-US"/>
+        </w:rPr>
+        <w:t xml:space="preserve"> communication</w:t>
+      </w:r>
+      <w:r>
+        <w:rPr>
+          <w:lang w:val="en-US"/>
+        </w:rPr>
+        <w:t xml:space="preserve"> and awareness</w:t>
+      </w:r>
+      <w:r>
+        <w:rPr>
+          <w:lang w:val="en-US"/>
+        </w:rPr>
+        <w:t xml:space="preserve"> of other rogues.</w:t>
+      </w:r>
+    </w:p>
+    <w:p>
+      <w:pPr>
+        <w:rPr>
+          <w:lang w:val="en-US"/>
+        </w:rPr>
+      </w:pPr>
+    </w:p>
+    <w:p>
+      <w:pPr>
+        <w:rPr>
+          <w:lang w:val="en-US"/>
+        </w:rPr>
+      </w:pPr>
+      <w:r>
+        <w:rPr>
+          <w:lang w:val="en-US"/>
+        </w:rPr>
+        <w:t>The most useful improvement was adding</w:t>
+      </w:r>
+      <w:r>
+        <w:rPr>
+          <w:lang w:val="en-US"/>
+        </w:rPr>
+        <w:t xml:space="preserve"> the internal map.</w:t>
+      </w:r>
+      <w:r>
+        <w:rPr>
+          <w:lang w:val="en-US"/>
+        </w:rPr>
+        <w:t xml:space="preserve"> Without memory</w:t>
+      </w:r>
+      <w:r>
+        <w:rPr>
+          <w:lang w:val="en-US"/>
+        </w:rPr>
+        <w:t>, the rogue could only</w:t>
+      </w:r>
+      <w:r>
+        <w:rPr>
+          <w:lang w:val="en-US"/>
+        </w:rPr>
+        <w:t xml:space="preserve"> react to the current percepts.</w:t>
+      </w:r>
+      <w:r>
+        <w:rPr>
+          <w:lang w:val="en-US"/>
+        </w:rPr>
+        <w:t xml:space="preserve"> With memory</w:t>
+      </w:r>
+      <w:r>
+        <w:rPr>
+          <w:lang w:val="en-US"/>
+        </w:rPr>
+        <w:t xml:space="preserve">, it could remember </w:t>
+      </w:r>
+      <w:r>
+        <w:rPr>
+          <w:lang w:val="en-US"/>
+        </w:rPr>
+        <w:t>previously</w:t>
+      </w:r>
+      <w:r>
+        <w:rPr>
+          <w:lang w:val="en-US"/>
+        </w:rPr>
+        <w:t xml:space="preserve"> seen treasures</w:t>
+      </w:r>
+      <w:r>
+        <w:rPr>
+          <w:lang w:val="en-US"/>
+        </w:rPr>
+        <w:t xml:space="preserve"> and walls.</w:t>
+      </w:r>
+      <w:r>
+        <w:rPr>
+          <w:lang w:val="en-US"/>
+        </w:rPr>
+        <w:t xml:space="preserve"> BFS also made</w:t>
+      </w:r>
+      <w:r>
+        <w:rPr>
+          <w:lang w:val="en-US"/>
+        </w:rPr>
+        <w:t xml:space="preserve"> the behavior much more</w:t>
+      </w:r>
+      <w:r>
+        <w:rPr>
+          <w:lang w:val="en-US"/>
+        </w:rPr>
+        <w:t xml:space="preserve"> purposeful</w:t>
+      </w:r>
+      <w:r>
+        <w:rPr>
+          <w:lang w:val="en-US"/>
+        </w:rPr>
+        <w:t xml:space="preserve"> because the rogue could</w:t>
+      </w:r>
+      <w:r>
+        <w:rPr>
+          <w:lang w:val="en-US"/>
+        </w:rPr>
+        <w:t xml:space="preserve"> follow a known path</w:t>
+      </w:r>
+      <w:r>
+        <w:rPr>
+          <w:lang w:val="en-US"/>
+        </w:rPr>
+        <w:t xml:space="preserve"> instead of wandering</w:t>
+      </w:r>
+      <w:r>
+        <w:rPr>
+          <w:lang w:val="en-US"/>
+        </w:rPr>
+        <w:t xml:space="preserve"> randomly.</w:t>
+      </w:r>
+    </w:p>
+    <w:p>
+      <w:pPr>
+        <w:rPr>
+          <w:lang w:val="en-US"/>
+        </w:rPr>
+      </w:pPr>
+    </w:p>
+    <w:p>
+      <w:pPr>
+        <w:rPr>
+          <w:lang w:val="en-US"/>
+        </w:rPr>
+      </w:pPr>
+      <w:r>
+        <w:rPr>
+          <w:lang w:val="en-US"/>
+        </w:rPr>
+        <w:t>The hardest part was</w:t>
+      </w:r>
+      <w:r>
+        <w:rPr>
+          <w:lang w:val="en-US"/>
+        </w:rPr>
+        <w:t xml:space="preserve"> trap reasoning.</w:t>
+      </w:r>
+      <w:r>
+        <w:rPr>
+          <w:lang w:val="en-US"/>
+        </w:rPr>
+        <w:t xml:space="preserve"> It is easy to understand</w:t>
+      </w:r>
+      <w:r>
+        <w:rPr>
+          <w:lang w:val="en-US"/>
+        </w:rPr>
+        <w:t xml:space="preserve"> as a human that</w:t>
+      </w:r>
+      <w:r>
+        <w:rPr>
+          <w:lang w:val="en-US"/>
+        </w:rPr>
+        <w:t xml:space="preserve"> a trap</w:t>
+      </w:r>
+      <w:r>
+        <w:rPr>
+          <w:lang w:val="en-US"/>
+        </w:rPr>
+        <w:t xml:space="preserve"> is “somewhere</w:t>
+      </w:r>
+      <w:r>
+        <w:rPr>
+          <w:lang w:val="en-US"/>
+        </w:rPr>
+        <w:t xml:space="preserve"> nearby</w:t>
+      </w:r>
+      <w:r>
+        <w:rPr>
+          <w:lang w:val="en-US"/>
+        </w:rPr>
+        <w:t>”</w:t>
+      </w:r>
+      <w:r>
+        <w:rPr>
+          <w:lang w:val="en-US"/>
+        </w:rPr>
+        <w:t>,</w:t>
+      </w:r>
+      <w:r>
+        <w:rPr>
+          <w:lang w:val="en-US"/>
+        </w:rPr>
+        <w:t xml:space="preserve"> but it is difficult to</w:t>
+      </w:r>
+      <w:r>
+        <w:rPr>
+          <w:lang w:val="en-US"/>
+        </w:rPr>
+        <w:t xml:space="preserve"> turn that into exact code.</w:t>
+      </w:r>
+      <w:r>
+        <w:rPr>
+          <w:lang w:val="en-US"/>
+        </w:rPr>
+        <w:t xml:space="preserve"> The detector</w:t>
+      </w:r>
+      <w:r>
+        <w:rPr>
+          <w:lang w:val="en-US"/>
+        </w:rPr>
+        <w:t xml:space="preserve"> gives useful information</w:t>
+      </w:r>
+      <w:r>
+        <w:rPr>
+          <w:lang w:val="en-US"/>
+        </w:rPr>
+        <w:t>, but it</w:t>
+      </w:r>
+      <w:r>
+        <w:rPr>
+          <w:lang w:val="en-US"/>
+        </w:rPr>
+        <w:t xml:space="preserve"> does not directly</w:t>
+      </w:r>
+      <w:r>
+        <w:rPr>
+          <w:lang w:val="en-US"/>
+        </w:rPr>
+        <w:t xml:space="preserve"> reveal the trap.</w:t>
+      </w:r>
+      <w:r>
+        <w:rPr>
+          <w:lang w:val="en-US"/>
+        </w:rPr>
+        <w:t xml:space="preserve"> My final solution</w:t>
+      </w:r>
+      <w:r>
+        <w:rPr>
+          <w:lang w:val="en-US"/>
+        </w:rPr>
+        <w:t xml:space="preserve"> uses uncertainty</w:t>
+      </w:r>
+      <w:r>
+        <w:rPr>
+          <w:lang w:val="en-US"/>
+        </w:rPr>
+        <w:t xml:space="preserve"> rather than</w:t>
+      </w:r>
+      <w:r>
+        <w:rPr>
+          <w:lang w:val="en-US"/>
+        </w:rPr>
+        <w:t xml:space="preserve"> perfect knowledge.</w:t>
       </w:r>
     </w:p>
     <w:sectPr>
@@ -113,9 +3095,9 @@
 <file path=word/numbering.xml><?xml version="1.0" encoding="utf-8"?>
 <w:numbering xmlns:wpc="http://schemas.microsoft.com/office/word/2010/wordprocessingCanvas" xmlns:cx="http://schemas.microsoft.com/office/drawing/2014/chartex" xmlns:cx1="http://schemas.microsoft.com/office/drawing/2015/9/8/chartex" xmlns:cx2="http://schemas.microsoft.com/office/drawing/2015/10/21/chartex" xmlns:cx3="http://schemas.microsoft.com/office/drawing/2016/5/9/chartex" xmlns:cx4="http://schemas.microsoft.com/office/drawing/2016/5/10/chartex" xmlns:cx5="http://schemas.microsoft.com/office/drawing/2016/5/11/chartex" xmlns:cx6="http://schemas.microsoft.com/office/drawing/2016/5/12/chartex" xmlns:cx7="http://schemas.microsoft.com/office/drawing/2016/5/13/chartex" xmlns:cx8="http://schemas.microsoft.com/office/drawing/2016/5/14/chartex" xmlns:mc="http://schemas.openxmlformats.org/markup-compatibility/2006" xmlns:aink="http://schemas.microsoft.com/office/drawing/2016/ink" xmlns:am3d="http://schemas.microsoft.com/office/drawing/2017/model3d" xmlns:o="urn:schemas-microsoft-com:office:office" xmlns:oel="http://schemas.microsoft.com/office/2019/extlst" xmlns:r="http://schemas.openxmlformats.org/officeDocument/2006/relationships" xmlns:m="http://schemas.openxmlformats.org/officeDocument/2006/math" xmlns:v="urn:schemas-microsoft-com:vml" xmlns:wp14="http://schemas.microsoft.com/office/word/2010/wordprocessingDrawing" xmlns:wp="http://schemas.openxmlformats.org/drawingml/2006/wordprocessingDrawing" xmlns:w10="urn:schemas-microsoft-com:office:word" xmlns:w="http://schemas.openxmlformats.org/wordprocessingml/2006/main" xmlns:w14="http://schemas.microsoft.com/office/word/2010/wordml" xmlns:w15="http://schemas.microsoft.com/office/word/2012/wordml" xmlns:w16cex="http://schemas.microsoft.com/office/word/2018/wordml/cex" xmlns:w16cid="http://schemas.microsoft.com/office/word/2016/wordml/cid" xmlns:w16="http://schemas.microsoft.com/office/word/2018/wordml" xmlns:w16du="http://schemas.microsoft.com/office/word/2023/wordml/word16du" xmlns:w16sdtdh="http://schemas.microsoft.com/office/word/2020/wordml/sdtdatahash" xmlns:w16sdtfl="http://schemas.microsoft.com/office/word/2024/wordml/sdtformatlock" xmlns:w16se="http://schemas.microsoft.com/office/word/2015/wordml/symex" xmlns:wpg="http://schemas.microsoft.com/office/word/2010/wordprocessingGroup" xmlns:wpi="http://schemas.microsoft.com/office/word/2010/wordprocessingInk" xmlns:wne="http://schemas.microsoft.com/office/word/2006/wordml" xmlns:wps="http://schemas.microsoft.com/office/word/2010/wordprocessingShape" mc:Ignorable="w14 w15 w16se w16cid w16 w16cex w16sdtdh w16sdtfl w16du wp14">
   <w:abstractNum w:abstractNumId="0" w15:restartNumberingAfterBreak="0">
-    <w:nsid w:val="4A0270EE"/>
+    <w:nsid w:val="2CDB12A6"/>
     <w:multiLevelType w:val="hybridMultilevel"/>
-    <w:tmpl w:val="37F4FA4A"/>
+    <w:tmpl w:val="11EE4726"/>
     <w:lvl w:ilvl="0" w:tplc="0402000F">
       <w:start w:val="1"/>
       <w:numFmt w:val="decimal"/>
@@ -201,7 +3183,191 @@
       </w:pPr>
     </w:lvl>
   </w:abstractNum>
+  <w:abstractNum w:abstractNumId="1" w15:restartNumberingAfterBreak="0">
+    <w:nsid w:val="4A0270EE"/>
+    <w:multiLevelType w:val="hybridMultilevel"/>
+    <w:tmpl w:val="37F4FA4A"/>
+    <w:lvl w:ilvl="0" w:tplc="0402000F">
+      <w:start w:val="1"/>
+      <w:numFmt w:val="decimal"/>
+      <w:lvlText w:val="%1."/>
+      <w:lvlJc w:val="left"/>
+      <w:pPr>
+        <w:ind w:left="720" w:hanging="360"/>
+      </w:pPr>
+      <w:rPr>
+        <w:rFonts w:hint="default"/>
+      </w:rPr>
+    </w:lvl>
+    <w:lvl w:ilvl="1" w:tplc="04020019" w:tentative="1">
+      <w:start w:val="1"/>
+      <w:numFmt w:val="lowerLetter"/>
+      <w:lvlText w:val="%2."/>
+      <w:lvlJc w:val="left"/>
+      <w:pPr>
+        <w:ind w:left="1440" w:hanging="360"/>
+      </w:pPr>
+    </w:lvl>
+    <w:lvl w:ilvl="2" w:tplc="0402001B" w:tentative="1">
+      <w:start w:val="1"/>
+      <w:numFmt w:val="lowerRoman"/>
+      <w:lvlText w:val="%3."/>
+      <w:lvlJc w:val="right"/>
+      <w:pPr>
+        <w:ind w:left="2160" w:hanging="180"/>
+      </w:pPr>
+    </w:lvl>
+    <w:lvl w:ilvl="3" w:tplc="0402000F" w:tentative="1">
+      <w:start w:val="1"/>
+      <w:numFmt w:val="decimal"/>
+      <w:lvlText w:val="%4."/>
+      <w:lvlJc w:val="left"/>
+      <w:pPr>
+        <w:ind w:left="2880" w:hanging="360"/>
+      </w:pPr>
+    </w:lvl>
+    <w:lvl w:ilvl="4" w:tplc="04020019" w:tentative="1">
+      <w:start w:val="1"/>
+      <w:numFmt w:val="lowerLetter"/>
+      <w:lvlText w:val="%5."/>
+      <w:lvlJc w:val="left"/>
+      <w:pPr>
+        <w:ind w:left="3600" w:hanging="360"/>
+      </w:pPr>
+    </w:lvl>
+    <w:lvl w:ilvl="5" w:tplc="0402001B" w:tentative="1">
+      <w:start w:val="1"/>
+      <w:numFmt w:val="lowerRoman"/>
+      <w:lvlText w:val="%6."/>
+      <w:lvlJc w:val="right"/>
+      <w:pPr>
+        <w:ind w:left="4320" w:hanging="180"/>
+      </w:pPr>
+    </w:lvl>
+    <w:lvl w:ilvl="6" w:tplc="0402000F" w:tentative="1">
+      <w:start w:val="1"/>
+      <w:numFmt w:val="decimal"/>
+      <w:lvlText w:val="%7."/>
+      <w:lvlJc w:val="left"/>
+      <w:pPr>
+        <w:ind w:left="5040" w:hanging="360"/>
+      </w:pPr>
+    </w:lvl>
+    <w:lvl w:ilvl="7" w:tplc="04020019" w:tentative="1">
+      <w:start w:val="1"/>
+      <w:numFmt w:val="lowerLetter"/>
+      <w:lvlText w:val="%8."/>
+      <w:lvlJc w:val="left"/>
+      <w:pPr>
+        <w:ind w:left="5760" w:hanging="360"/>
+      </w:pPr>
+    </w:lvl>
+    <w:lvl w:ilvl="8" w:tplc="0402001B" w:tentative="1">
+      <w:start w:val="1"/>
+      <w:numFmt w:val="lowerRoman"/>
+      <w:lvlText w:val="%9."/>
+      <w:lvlJc w:val="right"/>
+      <w:pPr>
+        <w:ind w:left="6480" w:hanging="180"/>
+      </w:pPr>
+    </w:lvl>
+  </w:abstractNum>
+  <w:abstractNum w:abstractNumId="2" w15:restartNumberingAfterBreak="0">
+    <w:nsid w:val="4C411DC4"/>
+    <w:multiLevelType w:val="hybridMultilevel"/>
+    <w:tmpl w:val="407086E8"/>
+    <w:lvl w:ilvl="0" w:tplc="0402000F">
+      <w:start w:val="1"/>
+      <w:numFmt w:val="decimal"/>
+      <w:lvlText w:val="%1."/>
+      <w:lvlJc w:val="left"/>
+      <w:pPr>
+        <w:ind w:left="720" w:hanging="360"/>
+      </w:pPr>
+      <w:rPr>
+        <w:rFonts w:hint="default"/>
+      </w:rPr>
+    </w:lvl>
+    <w:lvl w:ilvl="1" w:tplc="04020019" w:tentative="1">
+      <w:start w:val="1"/>
+      <w:numFmt w:val="lowerLetter"/>
+      <w:lvlText w:val="%2."/>
+      <w:lvlJc w:val="left"/>
+      <w:pPr>
+        <w:ind w:left="1440" w:hanging="360"/>
+      </w:pPr>
+    </w:lvl>
+    <w:lvl w:ilvl="2" w:tplc="0402001B" w:tentative="1">
+      <w:start w:val="1"/>
+      <w:numFmt w:val="lowerRoman"/>
+      <w:lvlText w:val="%3."/>
+      <w:lvlJc w:val="right"/>
+      <w:pPr>
+        <w:ind w:left="2160" w:hanging="180"/>
+      </w:pPr>
+    </w:lvl>
+    <w:lvl w:ilvl="3" w:tplc="0402000F" w:tentative="1">
+      <w:start w:val="1"/>
+      <w:numFmt w:val="decimal"/>
+      <w:lvlText w:val="%4."/>
+      <w:lvlJc w:val="left"/>
+      <w:pPr>
+        <w:ind w:left="2880" w:hanging="360"/>
+      </w:pPr>
+    </w:lvl>
+    <w:lvl w:ilvl="4" w:tplc="04020019" w:tentative="1">
+      <w:start w:val="1"/>
+      <w:numFmt w:val="lowerLetter"/>
+      <w:lvlText w:val="%5."/>
+      <w:lvlJc w:val="left"/>
+      <w:pPr>
+        <w:ind w:left="3600" w:hanging="360"/>
+      </w:pPr>
+    </w:lvl>
+    <w:lvl w:ilvl="5" w:tplc="0402001B" w:tentative="1">
+      <w:start w:val="1"/>
+      <w:numFmt w:val="lowerRoman"/>
+      <w:lvlText w:val="%6."/>
+      <w:lvlJc w:val="right"/>
+      <w:pPr>
+        <w:ind w:left="4320" w:hanging="180"/>
+      </w:pPr>
+    </w:lvl>
+    <w:lvl w:ilvl="6" w:tplc="0402000F" w:tentative="1">
+      <w:start w:val="1"/>
+      <w:numFmt w:val="decimal"/>
+      <w:lvlText w:val="%7."/>
+      <w:lvlJc w:val="left"/>
+      <w:pPr>
+        <w:ind w:left="5040" w:hanging="360"/>
+      </w:pPr>
+    </w:lvl>
+    <w:lvl w:ilvl="7" w:tplc="04020019" w:tentative="1">
+      <w:start w:val="1"/>
+      <w:numFmt w:val="lowerLetter"/>
+      <w:lvlText w:val="%8."/>
+      <w:lvlJc w:val="left"/>
+      <w:pPr>
+        <w:ind w:left="5760" w:hanging="360"/>
+      </w:pPr>
+    </w:lvl>
+    <w:lvl w:ilvl="8" w:tplc="0402001B" w:tentative="1">
+      <w:start w:val="1"/>
+      <w:numFmt w:val="lowerRoman"/>
+      <w:lvlText w:val="%9."/>
+      <w:lvlJc w:val="right"/>
+      <w:pPr>
+        <w:ind w:left="6480" w:hanging="180"/>
+      </w:pPr>
+    </w:lvl>
+  </w:abstractNum>
   <w:num w:numId="1" w16cid:durableId="403332165">
+    <w:abstractNumId w:val="1"/>
+  </w:num>
+  <w:num w:numId="2" w16cid:durableId="739979584">
+    <w:abstractNumId w:val="2"/>
+  </w:num>
+  <w:num w:numId="3" w16cid:durableId="1070035979">
     <w:abstractNumId w:val="0"/>
   </w:num>
 </w:numbering>

</xml_diff>